<commit_message>
fix: connect HomePage buttons to Layout modals via custom events
- Add event handlers in HomePage for booking, AI, test lookup, scroll
- Layout listens for bvdk:open-* events to trigger modals
- Fix non-functional buttons in Hero, QuickActions, CTABanner, Doctors
</commit_message>
<xml_diff>
--- a/dac-ta-uiux-tong-hop.docx
+++ b/dac-ta-uiux-tong-hop.docx
@@ -169,7 +169,7 @@
                 <w:sz w:val="20"/>
                 <w:szCs w:val="20"/>
               </w:rPr>
-              <w:t xml:space="preserve">2.5 — Hợp nhất</w:t>
+              <w:t xml:space="preserve">2.6 — Hợp nhất</w:t>
             </w:r>
           </w:p>
         </w:tc>
@@ -17333,7 +17333,7 @@
                 <w:sz w:val="20"/>
                 <w:szCs w:val="20"/>
               </w:rPr>
-              <w:t xml:space="preserve">Bài viết tin tức</w:t>
+              <w:t xml:space="preserve">Bài viết tin tức + Thông báo đấu thầu (mục 15.9)</w:t>
             </w:r>
           </w:p>
         </w:tc>
@@ -17362,7 +17362,7 @@
                 <w:sz w:val="20"/>
                 <w:szCs w:val="20"/>
               </w:rPr>
-              <w:t xml:space="preserve">Mục 7.11, 8.2, 8.3 (C4), 9.6</w:t>
+              <w:t xml:space="preserve">Mục 7.11, 8.2, 8.3 (C4), 9.6, 18.4</w:t>
             </w:r>
           </w:p>
         </w:tc>
@@ -17420,7 +17420,7 @@
                 <w:sz w:val="20"/>
                 <w:szCs w:val="20"/>
               </w:rPr>
-              <w:t xml:space="preserve">Đánh giá bệnh nhân</w:t>
+              <w:t xml:space="preserve">Đánh giá bệnh nhân (có duyệt nội dung)</w:t>
             </w:r>
           </w:p>
         </w:tc>
@@ -17479,7 +17479,7 @@
                 <w:sz w:val="20"/>
                 <w:szCs w:val="20"/>
               </w:rPr>
-              <w:t xml:space="preserve">admin_users</w:t>
+              <w:t xml:space="preserve">price_list</w:t>
             </w:r>
           </w:p>
         </w:tc>
@@ -17508,7 +17508,7 @@
                 <w:sz w:val="20"/>
                 <w:szCs w:val="20"/>
               </w:rPr>
-              <w:t xml:space="preserve">Tài khoản quản trị (Super Admin/Lễ tân/Bác sĩ)</w:t>
+              <w:t xml:space="preserve">Bảng giá dịch vụ/chuyên khoa (mới, v2.6)</w:t>
             </w:r>
           </w:p>
         </w:tc>
@@ -17537,7 +17537,357 @@
                 <w:sz w:val="20"/>
                 <w:szCs w:val="20"/>
               </w:rPr>
-              <w:t xml:space="preserve">Mục 9.1, 14.4</w:t>
+              <w:t xml:space="preserve">Mục 8.7 (Chi phí điều trị)</w:t>
+            </w:r>
+          </w:p>
+        </w:tc>
+      </w:tr>
+      <w:tr>
+        <w:tc>
+          <w:tcPr>
+            <w:tcW w:type="dxa" w:w="2057"/>
+            <w:tcMar>
+              <w:top w:type="dxa" w:w="100"/>
+              <w:left w:type="dxa" w:w="120"/>
+              <w:bottom w:type="dxa" w:w="100"/>
+              <w:right w:type="dxa" w:w="120"/>
+            </w:tcMar>
+            <w:vAlign w:val="center"/>
+          </w:tcPr>
+          <w:p>
+            <w:pPr>
+              <w:jc w:val="left"/>
+            </w:pPr>
+            <w:r>
+              <w:rPr>
+                <w:rFonts w:ascii="Calibri" w:cs="Calibri" w:eastAsia="Calibri" w:hAnsi="Calibri"/>
+                <w:b w:val="false"/>
+                <w:bCs w:val="false"/>
+                <w:color w:val="22302A"/>
+                <w:sz w:val="20"/>
+                <w:szCs w:val="20"/>
+              </w:rPr>
+              <w:t xml:space="preserve">facilities</w:t>
+            </w:r>
+          </w:p>
+        </w:tc>
+        <w:tc>
+          <w:tcPr>
+            <w:tcW w:type="dxa" w:w="4114"/>
+            <w:tcMar>
+              <w:top w:type="dxa" w:w="100"/>
+              <w:left w:type="dxa" w:w="120"/>
+              <w:bottom w:type="dxa" w:w="100"/>
+              <w:right w:type="dxa" w:w="120"/>
+            </w:tcMar>
+            <w:vAlign w:val="center"/>
+          </w:tcPr>
+          <w:p>
+            <w:pPr>
+              <w:jc w:val="left"/>
+            </w:pPr>
+            <w:r>
+              <w:rPr>
+                <w:rFonts w:ascii="Calibri" w:cs="Calibri" w:eastAsia="Calibri" w:hAnsi="Calibri"/>
+                <w:b w:val="false"/>
+                <w:bCs w:val="false"/>
+                <w:color w:val="22302A"/>
+                <w:sz w:val="20"/>
+                <w:szCs w:val="20"/>
+              </w:rPr>
+              <w:t xml:space="preserve">Danh sách cơ sở/địa điểm khám (mới, v2.6)</w:t>
+            </w:r>
+          </w:p>
+        </w:tc>
+        <w:tc>
+          <w:tcPr>
+            <w:tcW w:type="dxa" w:w="3179"/>
+            <w:tcMar>
+              <w:top w:type="dxa" w:w="100"/>
+              <w:left w:type="dxa" w:w="120"/>
+              <w:bottom w:type="dxa" w:w="100"/>
+              <w:right w:type="dxa" w:w="120"/>
+            </w:tcMar>
+            <w:vAlign w:val="center"/>
+          </w:tcPr>
+          <w:p>
+            <w:pPr>
+              <w:jc w:val="left"/>
+            </w:pPr>
+            <w:r>
+              <w:rPr>
+                <w:rFonts w:ascii="Calibri" w:cs="Calibri" w:eastAsia="Calibri" w:hAnsi="Calibri"/>
+                <w:b w:val="false"/>
+                <w:bCs w:val="false"/>
+                <w:color w:val="22302A"/>
+                <w:sz w:val="20"/>
+                <w:szCs w:val="20"/>
+              </w:rPr>
+              <w:t xml:space="preserve">Mục 8.6 (Template F), 8.7</w:t>
+            </w:r>
+          </w:p>
+        </w:tc>
+      </w:tr>
+      <w:tr>
+        <w:tc>
+          <w:tcPr>
+            <w:tcW w:type="dxa" w:w="2057"/>
+            <w:shd w:fill="F4F4F2" w:val="clear"/>
+            <w:tcMar>
+              <w:top w:type="dxa" w:w="100"/>
+              <w:left w:type="dxa" w:w="120"/>
+              <w:bottom w:type="dxa" w:w="100"/>
+              <w:right w:type="dxa" w:w="120"/>
+            </w:tcMar>
+            <w:vAlign w:val="center"/>
+          </w:tcPr>
+          <w:p>
+            <w:pPr>
+              <w:jc w:val="left"/>
+            </w:pPr>
+            <w:r>
+              <w:rPr>
+                <w:rFonts w:ascii="Calibri" w:cs="Calibri" w:eastAsia="Calibri" w:hAnsi="Calibri"/>
+                <w:b w:val="false"/>
+                <w:bCs w:val="false"/>
+                <w:color w:val="22302A"/>
+                <w:sz w:val="20"/>
+                <w:szCs w:val="20"/>
+              </w:rPr>
+              <w:t xml:space="preserve">organization_units</w:t>
+            </w:r>
+          </w:p>
+        </w:tc>
+        <w:tc>
+          <w:tcPr>
+            <w:tcW w:type="dxa" w:w="4114"/>
+            <w:shd w:fill="F4F4F2" w:val="clear"/>
+            <w:tcMar>
+              <w:top w:type="dxa" w:w="100"/>
+              <w:left w:type="dxa" w:w="120"/>
+              <w:bottom w:type="dxa" w:w="100"/>
+              <w:right w:type="dxa" w:w="120"/>
+            </w:tcMar>
+            <w:vAlign w:val="center"/>
+          </w:tcPr>
+          <w:p>
+            <w:pPr>
+              <w:jc w:val="left"/>
+            </w:pPr>
+            <w:r>
+              <w:rPr>
+                <w:rFonts w:ascii="Calibri" w:cs="Calibri" w:eastAsia="Calibri" w:hAnsi="Calibri"/>
+                <w:b w:val="false"/>
+                <w:bCs w:val="false"/>
+                <w:color w:val="22302A"/>
+                <w:sz w:val="20"/>
+                <w:szCs w:val="20"/>
+              </w:rPr>
+              <w:t xml:space="preserve">Sơ đồ tổ chức/phòng ban hành chính</w:t>
+            </w:r>
+          </w:p>
+        </w:tc>
+        <w:tc>
+          <w:tcPr>
+            <w:tcW w:type="dxa" w:w="3179"/>
+            <w:shd w:fill="F4F4F2" w:val="clear"/>
+            <w:tcMar>
+              <w:top w:type="dxa" w:w="100"/>
+              <w:left w:type="dxa" w:w="120"/>
+              <w:bottom w:type="dxa" w:w="100"/>
+              <w:right w:type="dxa" w:w="120"/>
+            </w:tcMar>
+            <w:vAlign w:val="center"/>
+          </w:tcPr>
+          <w:p>
+            <w:pPr>
+              <w:jc w:val="left"/>
+            </w:pPr>
+            <w:r>
+              <w:rPr>
+                <w:rFonts w:ascii="Calibri" w:cs="Calibri" w:eastAsia="Calibri" w:hAnsi="Calibri"/>
+                <w:b w:val="false"/>
+                <w:bCs w:val="false"/>
+                <w:color w:val="22302A"/>
+                <w:sz w:val="20"/>
+                <w:szCs w:val="20"/>
+              </w:rPr>
+              <w:t xml:space="preserve">Mục 9.2, 15.9, 18.3</w:t>
+            </w:r>
+          </w:p>
+        </w:tc>
+      </w:tr>
+      <w:tr>
+        <w:tc>
+          <w:tcPr>
+            <w:tcW w:type="dxa" w:w="2057"/>
+            <w:tcMar>
+              <w:top w:type="dxa" w:w="100"/>
+              <w:left w:type="dxa" w:w="120"/>
+              <w:bottom w:type="dxa" w:w="100"/>
+              <w:right w:type="dxa" w:w="120"/>
+            </w:tcMar>
+            <w:vAlign w:val="center"/>
+          </w:tcPr>
+          <w:p>
+            <w:pPr>
+              <w:jc w:val="left"/>
+            </w:pPr>
+            <w:r>
+              <w:rPr>
+                <w:rFonts w:ascii="Calibri" w:cs="Calibri" w:eastAsia="Calibri" w:hAnsi="Calibri"/>
+                <w:b w:val="false"/>
+                <w:bCs w:val="false"/>
+                <w:color w:val="22302A"/>
+                <w:sz w:val="20"/>
+                <w:szCs w:val="20"/>
+              </w:rPr>
+              <w:t xml:space="preserve">tender_files</w:t>
+            </w:r>
+          </w:p>
+        </w:tc>
+        <w:tc>
+          <w:tcPr>
+            <w:tcW w:type="dxa" w:w="4114"/>
+            <w:tcMar>
+              <w:top w:type="dxa" w:w="100"/>
+              <w:left w:type="dxa" w:w="120"/>
+              <w:bottom w:type="dxa" w:w="100"/>
+              <w:right w:type="dxa" w:w="120"/>
+            </w:tcMar>
+            <w:vAlign w:val="center"/>
+          </w:tcPr>
+          <w:p>
+            <w:pPr>
+              <w:jc w:val="left"/>
+            </w:pPr>
+            <w:r>
+              <w:rPr>
+                <w:rFonts w:ascii="Calibri" w:cs="Calibri" w:eastAsia="Calibri" w:hAnsi="Calibri"/>
+                <w:b w:val="false"/>
+                <w:bCs w:val="false"/>
+                <w:color w:val="22302A"/>
+                <w:sz w:val="20"/>
+                <w:szCs w:val="20"/>
+              </w:rPr>
+              <w:t xml:space="preserve">File đính kèm thông báo đấu thầu</w:t>
+            </w:r>
+          </w:p>
+        </w:tc>
+        <w:tc>
+          <w:tcPr>
+            <w:tcW w:type="dxa" w:w="3179"/>
+            <w:tcMar>
+              <w:top w:type="dxa" w:w="100"/>
+              <w:left w:type="dxa" w:w="120"/>
+              <w:bottom w:type="dxa" w:w="100"/>
+              <w:right w:type="dxa" w:w="120"/>
+            </w:tcMar>
+            <w:vAlign w:val="center"/>
+          </w:tcPr>
+          <w:p>
+            <w:pPr>
+              <w:jc w:val="left"/>
+            </w:pPr>
+            <w:r>
+              <w:rPr>
+                <w:rFonts w:ascii="Calibri" w:cs="Calibri" w:eastAsia="Calibri" w:hAnsi="Calibri"/>
+                <w:b w:val="false"/>
+                <w:bCs w:val="false"/>
+                <w:color w:val="22302A"/>
+                <w:sz w:val="20"/>
+                <w:szCs w:val="20"/>
+              </w:rPr>
+              <w:t xml:space="preserve">Mục 15.9, 18.4</w:t>
+            </w:r>
+          </w:p>
+        </w:tc>
+      </w:tr>
+      <w:tr>
+        <w:tc>
+          <w:tcPr>
+            <w:tcW w:type="dxa" w:w="2057"/>
+            <w:shd w:fill="F4F4F2" w:val="clear"/>
+            <w:tcMar>
+              <w:top w:type="dxa" w:w="100"/>
+              <w:left w:type="dxa" w:w="120"/>
+              <w:bottom w:type="dxa" w:w="100"/>
+              <w:right w:type="dxa" w:w="120"/>
+            </w:tcMar>
+            <w:vAlign w:val="center"/>
+          </w:tcPr>
+          <w:p>
+            <w:pPr>
+              <w:jc w:val="left"/>
+            </w:pPr>
+            <w:r>
+              <w:rPr>
+                <w:rFonts w:ascii="Calibri" w:cs="Calibri" w:eastAsia="Calibri" w:hAnsi="Calibri"/>
+                <w:b w:val="false"/>
+                <w:bCs w:val="false"/>
+                <w:color w:val="22302A"/>
+                <w:sz w:val="20"/>
+                <w:szCs w:val="20"/>
+              </w:rPr>
+              <w:t xml:space="preserve">admin_users</w:t>
+            </w:r>
+          </w:p>
+        </w:tc>
+        <w:tc>
+          <w:tcPr>
+            <w:tcW w:type="dxa" w:w="4114"/>
+            <w:shd w:fill="F4F4F2" w:val="clear"/>
+            <w:tcMar>
+              <w:top w:type="dxa" w:w="100"/>
+              <w:left w:type="dxa" w:w="120"/>
+              <w:bottom w:type="dxa" w:w="100"/>
+              <w:right w:type="dxa" w:w="120"/>
+            </w:tcMar>
+            <w:vAlign w:val="center"/>
+          </w:tcPr>
+          <w:p>
+            <w:pPr>
+              <w:jc w:val="left"/>
+            </w:pPr>
+            <w:r>
+              <w:rPr>
+                <w:rFonts w:ascii="Calibri" w:cs="Calibri" w:eastAsia="Calibri" w:hAnsi="Calibri"/>
+                <w:b w:val="false"/>
+                <w:bCs w:val="false"/>
+                <w:color w:val="22302A"/>
+                <w:sz w:val="20"/>
+                <w:szCs w:val="20"/>
+              </w:rPr>
+              <w:t xml:space="preserve">Tài khoản quản trị (Super Admin/Department Admin/Bác sĩ)</w:t>
+            </w:r>
+          </w:p>
+        </w:tc>
+        <w:tc>
+          <w:tcPr>
+            <w:tcW w:type="dxa" w:w="3179"/>
+            <w:shd w:fill="F4F4F2" w:val="clear"/>
+            <w:tcMar>
+              <w:top w:type="dxa" w:w="100"/>
+              <w:left w:type="dxa" w:w="120"/>
+              <w:bottom w:type="dxa" w:w="100"/>
+              <w:right w:type="dxa" w:w="120"/>
+            </w:tcMar>
+            <w:vAlign w:val="center"/>
+          </w:tcPr>
+          <w:p>
+            <w:pPr>
+              <w:jc w:val="left"/>
+            </w:pPr>
+            <w:r>
+              <w:rPr>
+                <w:rFonts w:ascii="Calibri" w:cs="Calibri" w:eastAsia="Calibri" w:hAnsi="Calibri"/>
+                <w:b w:val="false"/>
+                <w:bCs w:val="false"/>
+                <w:color w:val="22302A"/>
+                <w:sz w:val="20"/>
+                <w:szCs w:val="20"/>
+              </w:rPr>
+              <w:t xml:space="preserve">Mục 9.1, 14.4, 18.2</w:t>
             </w:r>
           </w:p>
         </w:tc>
@@ -20184,7 +20534,7 @@
                 <w:sz w:val="20"/>
                 <w:szCs w:val="20"/>
               </w:rPr>
-              <w:t xml:space="preserve">super_admin / receptionist / doctor — khớp bảng phân quyền mục 9.1.</w:t>
+              <w:t xml:space="preserve">super_admin / department_admin / doctor — khớp bảng phân quyền mục 9.1 (department_admin là tên chính thức từ v2.5, thay cho receptionist).</w:t>
             </w:r>
           </w:p>
         </w:tc>
@@ -20214,7 +20564,7 @@
                 <w:sz w:val="20"/>
                 <w:szCs w:val="20"/>
               </w:rPr>
-              <w:t xml:space="preserve">mfa_secret</w:t>
+              <w:t xml:space="preserve">department_id</w:t>
             </w:r>
           </w:p>
         </w:tc>
@@ -20242,7 +20592,7 @@
                 <w:sz w:val="20"/>
                 <w:szCs w:val="20"/>
               </w:rPr>
-              <w:t xml:space="preserve">VARCHAR(255) NULL</w:t>
+              <w:t xml:space="preserve">UUID (FK → organization_units.id, nullable)</w:t>
             </w:r>
           </w:p>
         </w:tc>
@@ -20270,7 +20620,7 @@
                 <w:sz w:val="20"/>
                 <w:szCs w:val="20"/>
               </w:rPr>
-              <w:t xml:space="preserve">Khoá xác thực 2 lớp (2FA) — bắt buộc theo mục 14.4.</w:t>
+              <w:t xml:space="preserve">Chỉ áp dụng nếu role = department_admin; xác định phòng ban được quyền quản lý Tin tức/Đấu thầu (mục 9.1, 18.2).</w:t>
             </w:r>
           </w:p>
         </w:tc>
@@ -20301,7 +20651,7 @@
                 <w:sz w:val="20"/>
                 <w:szCs w:val="20"/>
               </w:rPr>
-              <w:t xml:space="preserve">doctor_id</w:t>
+              <w:t xml:space="preserve">mfa_secret</w:t>
             </w:r>
           </w:p>
         </w:tc>
@@ -20330,7 +20680,7 @@
                 <w:sz w:val="20"/>
                 <w:szCs w:val="20"/>
               </w:rPr>
-              <w:t xml:space="preserve">UUID (FK → doctors.id, nullable)</w:t>
+              <w:t xml:space="preserve">VARCHAR(255) NULL</w:t>
             </w:r>
           </w:p>
         </w:tc>
@@ -20359,7 +20709,7 @@
                 <w:sz w:val="20"/>
                 <w:szCs w:val="20"/>
               </w:rPr>
-              <w:t xml:space="preserve">Chỉ áp dụng nếu role = doctor, liên kết hồ sơ bác sĩ tương ứng.</w:t>
+              <w:t xml:space="preserve">Khoá xác thực 2 lớp (2FA) — bắt buộc theo mục 14.4.</w:t>
             </w:r>
           </w:p>
         </w:tc>
@@ -20389,7 +20739,7 @@
                 <w:sz w:val="20"/>
                 <w:szCs w:val="20"/>
               </w:rPr>
-              <w:t xml:space="preserve">last_login_at</w:t>
+              <w:t xml:space="preserve">doctor_id</w:t>
             </w:r>
           </w:p>
         </w:tc>
@@ -20417,7 +20767,7 @@
                 <w:sz w:val="20"/>
                 <w:szCs w:val="20"/>
               </w:rPr>
-              <w:t xml:space="preserve">TIMESTAMP</w:t>
+              <w:t xml:space="preserve">UUID (FK → doctors.id, nullable)</w:t>
             </w:r>
           </w:p>
         </w:tc>
@@ -20445,7 +20795,7 @@
                 <w:sz w:val="20"/>
                 <w:szCs w:val="20"/>
               </w:rPr>
-              <w:t xml:space="preserve">Phục vụ giám sát đăng nhập bất thường.</w:t>
+              <w:t xml:space="preserve">Chỉ áp dụng nếu role = doctor, liên kết hồ sơ bác sĩ tương ứng.</w:t>
             </w:r>
           </w:p>
         </w:tc>
@@ -20476,7 +20826,7 @@
                 <w:sz w:val="20"/>
                 <w:szCs w:val="20"/>
               </w:rPr>
-              <w:t xml:space="preserve">is_active</w:t>
+              <w:t xml:space="preserve">last_login_at</w:t>
             </w:r>
           </w:p>
         </w:tc>
@@ -20505,7 +20855,7 @@
                 <w:sz w:val="20"/>
                 <w:szCs w:val="20"/>
               </w:rPr>
-              <w:t xml:space="preserve">BOOLEAN</w:t>
+              <w:t xml:space="preserve">TIMESTAMP</w:t>
             </w:r>
           </w:p>
         </w:tc>
@@ -20513,6 +20863,92 @@
           <w:tcPr>
             <w:tcW w:type="dxa" w:w="4301"/>
             <w:shd w:fill="F4F4F2" w:val="clear"/>
+            <w:tcMar>
+              <w:top w:type="dxa" w:w="100"/>
+              <w:left w:type="dxa" w:w="120"/>
+              <w:bottom w:type="dxa" w:w="100"/>
+              <w:right w:type="dxa" w:w="120"/>
+            </w:tcMar>
+            <w:vAlign w:val="center"/>
+          </w:tcPr>
+          <w:p>
+            <w:pPr>
+              <w:jc w:val="left"/>
+            </w:pPr>
+            <w:r>
+              <w:rPr>
+                <w:rFonts w:ascii="Calibri" w:cs="Calibri" w:eastAsia="Calibri" w:hAnsi="Calibri"/>
+                <w:b w:val="false"/>
+                <w:bCs w:val="false"/>
+                <w:color w:val="22302A"/>
+                <w:sz w:val="20"/>
+                <w:szCs w:val="20"/>
+              </w:rPr>
+              <w:t xml:space="preserve">Phục vụ giám sát đăng nhập bất thường.</w:t>
+            </w:r>
+          </w:p>
+        </w:tc>
+      </w:tr>
+      <w:tr>
+        <w:tc>
+          <w:tcPr>
+            <w:tcW w:type="dxa" w:w="2244"/>
+            <w:tcMar>
+              <w:top w:type="dxa" w:w="100"/>
+              <w:left w:type="dxa" w:w="120"/>
+              <w:bottom w:type="dxa" w:w="100"/>
+              <w:right w:type="dxa" w:w="120"/>
+            </w:tcMar>
+            <w:vAlign w:val="center"/>
+          </w:tcPr>
+          <w:p>
+            <w:pPr>
+              <w:jc w:val="left"/>
+            </w:pPr>
+            <w:r>
+              <w:rPr>
+                <w:rFonts w:ascii="Calibri" w:cs="Calibri" w:eastAsia="Calibri" w:hAnsi="Calibri"/>
+                <w:b w:val="false"/>
+                <w:bCs w:val="false"/>
+                <w:color w:val="22302A"/>
+                <w:sz w:val="20"/>
+                <w:szCs w:val="20"/>
+              </w:rPr>
+              <w:t xml:space="preserve">is_active</w:t>
+            </w:r>
+          </w:p>
+        </w:tc>
+        <w:tc>
+          <w:tcPr>
+            <w:tcW w:type="dxa" w:w="2805"/>
+            <w:tcMar>
+              <w:top w:type="dxa" w:w="100"/>
+              <w:left w:type="dxa" w:w="120"/>
+              <w:bottom w:type="dxa" w:w="100"/>
+              <w:right w:type="dxa" w:w="120"/>
+            </w:tcMar>
+            <w:vAlign w:val="center"/>
+          </w:tcPr>
+          <w:p>
+            <w:pPr>
+              <w:jc w:val="left"/>
+            </w:pPr>
+            <w:r>
+              <w:rPr>
+                <w:rFonts w:ascii="Calibri" w:cs="Calibri" w:eastAsia="Calibri" w:hAnsi="Calibri"/>
+                <w:b w:val="false"/>
+                <w:bCs w:val="false"/>
+                <w:color w:val="22302A"/>
+                <w:sz w:val="20"/>
+                <w:szCs w:val="20"/>
+              </w:rPr>
+              <w:t xml:space="preserve">BOOLEAN</w:t>
+            </w:r>
+          </w:p>
+        </w:tc>
+        <w:tc>
+          <w:tcPr>
+            <w:tcW w:type="dxa" w:w="4301"/>
             <w:tcMar>
               <w:top w:type="dxa" w:w="100"/>
               <w:left w:type="dxa" w:w="120"/>
@@ -21952,7 +22388,3978 @@
           <w:sz w:val="21"/>
           <w:szCs w:val="21"/>
         </w:rPr>
-        <w:t xml:space="preserve">Bảng admin_users bổ sung cột department_id (UUID, FK → organization_units.id, nullable) để gán Department Admin vào đúng phòng ban, làm căn cứ lọc quyền xem/sửa Thông báo đấu thầu theo mục 9.1/18.2.</w:t>
+        <w:t xml:space="preserve">Cột admin_users.department_id đã được thêm trực tiếp vào bảng field ở mục 15.5 (không lặp lại tại đây).</w:t>
+      </w:r>
+    </w:p>
+    <w:p>
+      <w:pPr>
+        <w:pStyle w:val="Heading2"/>
+        <w:spacing w:after="140" w:before="320"/>
+      </w:pPr>
+      <w:r>
+        <w:rPr>
+          <w:rFonts w:ascii="Calibri" w:cs="Calibri" w:eastAsia="Calibri" w:hAnsi="Calibri"/>
+          <w:b/>
+          <w:bCs/>
+          <w:color w:val="164B36"/>
+        </w:rPr>
+        <w:t xml:space="preserve">15.10. Lược đồ chi tiết — Các bảng còn lại (bổ sung v2.6)</w:t>
+      </w:r>
+    </w:p>
+    <w:p>
+      <w:pPr>
+        <w:spacing w:after="140" w:line="300"/>
+      </w:pPr>
+      <w:r>
+        <w:rPr>
+          <w:rFonts w:ascii="Calibri" w:cs="Calibri" w:eastAsia="Calibri" w:hAnsi="Calibri"/>
+          <w:color w:val="22302A"/>
+          <w:sz w:val="21"/>
+          <w:szCs w:val="21"/>
+        </w:rPr>
+        <w:t xml:space="preserve">Bổ sung field-level cho các bảng mới chỉ có mô tả tổng quan ở mục 15.2, để dev có đủ căn cứ dựng schema mà không phải tự suy đoán.</w:t>
+      </w:r>
+    </w:p>
+    <w:p>
+      <w:pPr>
+        <w:pStyle w:val="Heading3"/>
+        <w:spacing w:after="100" w:before="220"/>
+      </w:pPr>
+      <w:r>
+        <w:rPr>
+          <w:rFonts w:ascii="Calibri" w:cs="Calibri" w:eastAsia="Calibri" w:hAnsi="Calibri"/>
+          <w:b/>
+          <w:bCs/>
+          <w:color w:val="2FA968"/>
+        </w:rPr>
+        <w:t xml:space="preserve">specialties / service_groups / services</w:t>
+      </w:r>
+    </w:p>
+    <w:tbl>
+      <w:tblPr>
+        <w:tblW w:type="dxa" w:w="9350"/>
+        <w:tblBorders>
+          <w:top w:val="single" w:color="auto" w:sz="4"/>
+          <w:left w:val="single" w:color="auto" w:sz="4"/>
+          <w:bottom w:val="single" w:color="auto" w:sz="4"/>
+          <w:right w:val="single" w:color="auto" w:sz="4"/>
+          <w:insideH w:val="single" w:color="auto" w:sz="4"/>
+          <w:insideV w:val="single" w:color="auto" w:sz="4"/>
+        </w:tblBorders>
+      </w:tblPr>
+      <w:tblGrid>
+        <w:gridCol w:w="2057"/>
+        <w:gridCol w:w="2805"/>
+        <w:gridCol w:w="4488"/>
+      </w:tblGrid>
+      <w:tr>
+        <w:trPr>
+          <w:tblHeader/>
+        </w:trPr>
+        <w:tc>
+          <w:tcPr>
+            <w:tcW w:type="dxa" w:w="2057"/>
+            <w:shd w:fill="164B36" w:val="clear"/>
+            <w:tcMar>
+              <w:top w:type="dxa" w:w="100"/>
+              <w:left w:type="dxa" w:w="120"/>
+              <w:bottom w:type="dxa" w:w="100"/>
+              <w:right w:type="dxa" w:w="120"/>
+            </w:tcMar>
+            <w:vAlign w:val="center"/>
+          </w:tcPr>
+          <w:p>
+            <w:pPr>
+              <w:jc w:val="left"/>
+            </w:pPr>
+            <w:r>
+              <w:rPr>
+                <w:rFonts w:ascii="Calibri" w:cs="Calibri" w:eastAsia="Calibri" w:hAnsi="Calibri"/>
+                <w:b/>
+                <w:bCs/>
+                <w:color w:val="FFFFFF"/>
+                <w:sz w:val="19"/>
+                <w:szCs w:val="19"/>
+              </w:rPr>
+              <w:t xml:space="preserve">Trường</w:t>
+            </w:r>
+          </w:p>
+        </w:tc>
+        <w:tc>
+          <w:tcPr>
+            <w:tcW w:type="dxa" w:w="2805"/>
+            <w:shd w:fill="164B36" w:val="clear"/>
+            <w:tcMar>
+              <w:top w:type="dxa" w:w="100"/>
+              <w:left w:type="dxa" w:w="120"/>
+              <w:bottom w:type="dxa" w:w="100"/>
+              <w:right w:type="dxa" w:w="120"/>
+            </w:tcMar>
+            <w:vAlign w:val="center"/>
+          </w:tcPr>
+          <w:p>
+            <w:pPr>
+              <w:jc w:val="left"/>
+            </w:pPr>
+            <w:r>
+              <w:rPr>
+                <w:rFonts w:ascii="Calibri" w:cs="Calibri" w:eastAsia="Calibri" w:hAnsi="Calibri"/>
+                <w:b/>
+                <w:bCs/>
+                <w:color w:val="FFFFFF"/>
+                <w:sz w:val="19"/>
+                <w:szCs w:val="19"/>
+              </w:rPr>
+              <w:t xml:space="preserve">Kiểu dữ liệu</w:t>
+            </w:r>
+          </w:p>
+        </w:tc>
+        <w:tc>
+          <w:tcPr>
+            <w:tcW w:type="dxa" w:w="4488"/>
+            <w:shd w:fill="164B36" w:val="clear"/>
+            <w:tcMar>
+              <w:top w:type="dxa" w:w="100"/>
+              <w:left w:type="dxa" w:w="120"/>
+              <w:bottom w:type="dxa" w:w="100"/>
+              <w:right w:type="dxa" w:w="120"/>
+            </w:tcMar>
+            <w:vAlign w:val="center"/>
+          </w:tcPr>
+          <w:p>
+            <w:pPr>
+              <w:jc w:val="left"/>
+            </w:pPr>
+            <w:r>
+              <w:rPr>
+                <w:rFonts w:ascii="Calibri" w:cs="Calibri" w:eastAsia="Calibri" w:hAnsi="Calibri"/>
+                <w:b/>
+                <w:bCs/>
+                <w:color w:val="FFFFFF"/>
+                <w:sz w:val="19"/>
+                <w:szCs w:val="19"/>
+              </w:rPr>
+              <w:t xml:space="preserve">Ghi chú</w:t>
+            </w:r>
+          </w:p>
+        </w:tc>
+      </w:tr>
+      <w:tr>
+        <w:tc>
+          <w:tcPr>
+            <w:tcW w:type="dxa" w:w="2057"/>
+            <w:tcMar>
+              <w:top w:type="dxa" w:w="100"/>
+              <w:left w:type="dxa" w:w="120"/>
+              <w:bottom w:type="dxa" w:w="100"/>
+              <w:right w:type="dxa" w:w="120"/>
+            </w:tcMar>
+            <w:vAlign w:val="center"/>
+          </w:tcPr>
+          <w:p>
+            <w:pPr>
+              <w:jc w:val="left"/>
+            </w:pPr>
+            <w:r>
+              <w:rPr>
+                <w:rFonts w:ascii="Calibri" w:cs="Calibri" w:eastAsia="Calibri" w:hAnsi="Calibri"/>
+                <w:b w:val="false"/>
+                <w:bCs w:val="false"/>
+                <w:color w:val="22302A"/>
+                <w:sz w:val="20"/>
+                <w:szCs w:val="20"/>
+              </w:rPr>
+              <w:t xml:space="preserve">id</w:t>
+            </w:r>
+          </w:p>
+        </w:tc>
+        <w:tc>
+          <w:tcPr>
+            <w:tcW w:type="dxa" w:w="2805"/>
+            <w:tcMar>
+              <w:top w:type="dxa" w:w="100"/>
+              <w:left w:type="dxa" w:w="120"/>
+              <w:bottom w:type="dxa" w:w="100"/>
+              <w:right w:type="dxa" w:w="120"/>
+            </w:tcMar>
+            <w:vAlign w:val="center"/>
+          </w:tcPr>
+          <w:p>
+            <w:pPr>
+              <w:jc w:val="left"/>
+            </w:pPr>
+            <w:r>
+              <w:rPr>
+                <w:rFonts w:ascii="Calibri" w:cs="Calibri" w:eastAsia="Calibri" w:hAnsi="Calibri"/>
+                <w:b w:val="false"/>
+                <w:bCs w:val="false"/>
+                <w:color w:val="22302A"/>
+                <w:sz w:val="20"/>
+                <w:szCs w:val="20"/>
+              </w:rPr>
+              <w:t xml:space="preserve">UUID (PK)</w:t>
+            </w:r>
+          </w:p>
+        </w:tc>
+        <w:tc>
+          <w:tcPr>
+            <w:tcW w:type="dxa" w:w="4488"/>
+            <w:tcMar>
+              <w:top w:type="dxa" w:w="100"/>
+              <w:left w:type="dxa" w:w="120"/>
+              <w:bottom w:type="dxa" w:w="100"/>
+              <w:right w:type="dxa" w:w="120"/>
+            </w:tcMar>
+            <w:vAlign w:val="center"/>
+          </w:tcPr>
+          <w:p>
+            <w:pPr>
+              <w:jc w:val="left"/>
+            </w:pPr>
+            <w:r>
+              <w:rPr>
+                <w:rFonts w:ascii="Calibri" w:cs="Calibri" w:eastAsia="Calibri" w:hAnsi="Calibri"/>
+                <w:b w:val="false"/>
+                <w:bCs w:val="false"/>
+                <w:color w:val="22302A"/>
+                <w:sz w:val="20"/>
+                <w:szCs w:val="20"/>
+              </w:rPr>
+              <w:t xml:space="preserve">Khoá chính, dùng chung cho cả 3 bảng.</w:t>
+            </w:r>
+          </w:p>
+        </w:tc>
+      </w:tr>
+      <w:tr>
+        <w:tc>
+          <w:tcPr>
+            <w:tcW w:type="dxa" w:w="2057"/>
+            <w:shd w:fill="F4F4F2" w:val="clear"/>
+            <w:tcMar>
+              <w:top w:type="dxa" w:w="100"/>
+              <w:left w:type="dxa" w:w="120"/>
+              <w:bottom w:type="dxa" w:w="100"/>
+              <w:right w:type="dxa" w:w="120"/>
+            </w:tcMar>
+            <w:vAlign w:val="center"/>
+          </w:tcPr>
+          <w:p>
+            <w:pPr>
+              <w:jc w:val="left"/>
+            </w:pPr>
+            <w:r>
+              <w:rPr>
+                <w:rFonts w:ascii="Calibri" w:cs="Calibri" w:eastAsia="Calibri" w:hAnsi="Calibri"/>
+                <w:b w:val="false"/>
+                <w:bCs w:val="false"/>
+                <w:color w:val="22302A"/>
+                <w:sz w:val="20"/>
+                <w:szCs w:val="20"/>
+              </w:rPr>
+              <w:t xml:space="preserve">name / slug</w:t>
+            </w:r>
+          </w:p>
+        </w:tc>
+        <w:tc>
+          <w:tcPr>
+            <w:tcW w:type="dxa" w:w="2805"/>
+            <w:shd w:fill="F4F4F2" w:val="clear"/>
+            <w:tcMar>
+              <w:top w:type="dxa" w:w="100"/>
+              <w:left w:type="dxa" w:w="120"/>
+              <w:bottom w:type="dxa" w:w="100"/>
+              <w:right w:type="dxa" w:w="120"/>
+            </w:tcMar>
+            <w:vAlign w:val="center"/>
+          </w:tcPr>
+          <w:p>
+            <w:pPr>
+              <w:jc w:val="left"/>
+            </w:pPr>
+            <w:r>
+              <w:rPr>
+                <w:rFonts w:ascii="Calibri" w:cs="Calibri" w:eastAsia="Calibri" w:hAnsi="Calibri"/>
+                <w:b w:val="false"/>
+                <w:bCs w:val="false"/>
+                <w:color w:val="22302A"/>
+                <w:sz w:val="20"/>
+                <w:szCs w:val="20"/>
+              </w:rPr>
+              <w:t xml:space="preserve">VARCHAR(150) / VARCHAR(150) UNIQUE</w:t>
+            </w:r>
+          </w:p>
+        </w:tc>
+        <w:tc>
+          <w:tcPr>
+            <w:tcW w:type="dxa" w:w="4488"/>
+            <w:shd w:fill="F4F4F2" w:val="clear"/>
+            <w:tcMar>
+              <w:top w:type="dxa" w:w="100"/>
+              <w:left w:type="dxa" w:w="120"/>
+              <w:bottom w:type="dxa" w:w="100"/>
+              <w:right w:type="dxa" w:w="120"/>
+            </w:tcMar>
+            <w:vAlign w:val="center"/>
+          </w:tcPr>
+          <w:p>
+            <w:pPr>
+              <w:jc w:val="left"/>
+            </w:pPr>
+            <w:r>
+              <w:rPr>
+                <w:rFonts w:ascii="Calibri" w:cs="Calibri" w:eastAsia="Calibri" w:hAnsi="Calibri"/>
+                <w:b w:val="false"/>
+                <w:bCs w:val="false"/>
+                <w:color w:val="22302A"/>
+                <w:sz w:val="20"/>
+                <w:szCs w:val="20"/>
+              </w:rPr>
+              <w:t xml:space="preserve">slug dùng cho URL trang chi tiết (mục 8.3, 8.9).</w:t>
+            </w:r>
+          </w:p>
+        </w:tc>
+      </w:tr>
+      <w:tr>
+        <w:tc>
+          <w:tcPr>
+            <w:tcW w:type="dxa" w:w="2057"/>
+            <w:tcMar>
+              <w:top w:type="dxa" w:w="100"/>
+              <w:left w:type="dxa" w:w="120"/>
+              <w:bottom w:type="dxa" w:w="100"/>
+              <w:right w:type="dxa" w:w="120"/>
+            </w:tcMar>
+            <w:vAlign w:val="center"/>
+          </w:tcPr>
+          <w:p>
+            <w:pPr>
+              <w:jc w:val="left"/>
+            </w:pPr>
+            <w:r>
+              <w:rPr>
+                <w:rFonts w:ascii="Calibri" w:cs="Calibri" w:eastAsia="Calibri" w:hAnsi="Calibri"/>
+                <w:b w:val="false"/>
+                <w:bCs w:val="false"/>
+                <w:color w:val="22302A"/>
+                <w:sz w:val="20"/>
+                <w:szCs w:val="20"/>
+              </w:rPr>
+              <w:t xml:space="preserve">group_id (chỉ ở services)</w:t>
+            </w:r>
+          </w:p>
+        </w:tc>
+        <w:tc>
+          <w:tcPr>
+            <w:tcW w:type="dxa" w:w="2805"/>
+            <w:tcMar>
+              <w:top w:type="dxa" w:w="100"/>
+              <w:left w:type="dxa" w:w="120"/>
+              <w:bottom w:type="dxa" w:w="100"/>
+              <w:right w:type="dxa" w:w="120"/>
+            </w:tcMar>
+            <w:vAlign w:val="center"/>
+          </w:tcPr>
+          <w:p>
+            <w:pPr>
+              <w:jc w:val="left"/>
+            </w:pPr>
+            <w:r>
+              <w:rPr>
+                <w:rFonts w:ascii="Calibri" w:cs="Calibri" w:eastAsia="Calibri" w:hAnsi="Calibri"/>
+                <w:b w:val="false"/>
+                <w:bCs w:val="false"/>
+                <w:color w:val="22302A"/>
+                <w:sz w:val="20"/>
+                <w:szCs w:val="20"/>
+              </w:rPr>
+              <w:t xml:space="preserve">UUID (FK → service_groups.id)</w:t>
+            </w:r>
+          </w:p>
+        </w:tc>
+        <w:tc>
+          <w:tcPr>
+            <w:tcW w:type="dxa" w:w="4488"/>
+            <w:tcMar>
+              <w:top w:type="dxa" w:w="100"/>
+              <w:left w:type="dxa" w:w="120"/>
+              <w:bottom w:type="dxa" w:w="100"/>
+              <w:right w:type="dxa" w:w="120"/>
+            </w:tcMar>
+            <w:vAlign w:val="center"/>
+          </w:tcPr>
+          <w:p>
+            <w:pPr>
+              <w:jc w:val="left"/>
+            </w:pPr>
+            <w:r>
+              <w:rPr>
+                <w:rFonts w:ascii="Calibri" w:cs="Calibri" w:eastAsia="Calibri" w:hAnsi="Calibri"/>
+                <w:b w:val="false"/>
+                <w:bCs w:val="false"/>
+                <w:color w:val="22302A"/>
+                <w:sz w:val="20"/>
+                <w:szCs w:val="20"/>
+              </w:rPr>
+              <w:t xml:space="preserve">Dịch vụ con thuộc nhóm nào.</w:t>
+            </w:r>
+          </w:p>
+        </w:tc>
+      </w:tr>
+      <w:tr>
+        <w:tc>
+          <w:tcPr>
+            <w:tcW w:type="dxa" w:w="2057"/>
+            <w:shd w:fill="F4F4F2" w:val="clear"/>
+            <w:tcMar>
+              <w:top w:type="dxa" w:w="100"/>
+              <w:left w:type="dxa" w:w="120"/>
+              <w:bottom w:type="dxa" w:w="100"/>
+              <w:right w:type="dxa" w:w="120"/>
+            </w:tcMar>
+            <w:vAlign w:val="center"/>
+          </w:tcPr>
+          <w:p>
+            <w:pPr>
+              <w:jc w:val="left"/>
+            </w:pPr>
+            <w:r>
+              <w:rPr>
+                <w:rFonts w:ascii="Calibri" w:cs="Calibri" w:eastAsia="Calibri" w:hAnsi="Calibri"/>
+                <w:b w:val="false"/>
+                <w:bCs w:val="false"/>
+                <w:color w:val="22302A"/>
+                <w:sz w:val="20"/>
+                <w:szCs w:val="20"/>
+              </w:rPr>
+              <w:t xml:space="preserve">icon_key</w:t>
+            </w:r>
+          </w:p>
+        </w:tc>
+        <w:tc>
+          <w:tcPr>
+            <w:tcW w:type="dxa" w:w="2805"/>
+            <w:shd w:fill="F4F4F2" w:val="clear"/>
+            <w:tcMar>
+              <w:top w:type="dxa" w:w="100"/>
+              <w:left w:type="dxa" w:w="120"/>
+              <w:bottom w:type="dxa" w:w="100"/>
+              <w:right w:type="dxa" w:w="120"/>
+            </w:tcMar>
+            <w:vAlign w:val="center"/>
+          </w:tcPr>
+          <w:p>
+            <w:pPr>
+              <w:jc w:val="left"/>
+            </w:pPr>
+            <w:r>
+              <w:rPr>
+                <w:rFonts w:ascii="Calibri" w:cs="Calibri" w:eastAsia="Calibri" w:hAnsi="Calibri"/>
+                <w:b w:val="false"/>
+                <w:bCs w:val="false"/>
+                <w:color w:val="22302A"/>
+                <w:sz w:val="20"/>
+                <w:szCs w:val="20"/>
+              </w:rPr>
+              <w:t xml:space="preserve">VARCHAR(50)</w:t>
+            </w:r>
+          </w:p>
+        </w:tc>
+        <w:tc>
+          <w:tcPr>
+            <w:tcW w:type="dxa" w:w="4488"/>
+            <w:shd w:fill="F4F4F2" w:val="clear"/>
+            <w:tcMar>
+              <w:top w:type="dxa" w:w="100"/>
+              <w:left w:type="dxa" w:w="120"/>
+              <w:bottom w:type="dxa" w:w="100"/>
+              <w:right w:type="dxa" w:w="120"/>
+            </w:tcMar>
+            <w:vAlign w:val="center"/>
+          </w:tcPr>
+          <w:p>
+            <w:pPr>
+              <w:jc w:val="left"/>
+            </w:pPr>
+            <w:r>
+              <w:rPr>
+                <w:rFonts w:ascii="Calibri" w:cs="Calibri" w:eastAsia="Calibri" w:hAnsi="Calibri"/>
+                <w:b w:val="false"/>
+                <w:bCs w:val="false"/>
+                <w:color w:val="22302A"/>
+                <w:sz w:val="20"/>
+                <w:szCs w:val="20"/>
+              </w:rPr>
+              <w:t xml:space="preserve">Tên icon squircle theo mục 5.2.</w:t>
+            </w:r>
+          </w:p>
+        </w:tc>
+      </w:tr>
+      <w:tr>
+        <w:tc>
+          <w:tcPr>
+            <w:tcW w:type="dxa" w:w="2057"/>
+            <w:tcMar>
+              <w:top w:type="dxa" w:w="100"/>
+              <w:left w:type="dxa" w:w="120"/>
+              <w:bottom w:type="dxa" w:w="100"/>
+              <w:right w:type="dxa" w:w="120"/>
+            </w:tcMar>
+            <w:vAlign w:val="center"/>
+          </w:tcPr>
+          <w:p>
+            <w:pPr>
+              <w:jc w:val="left"/>
+            </w:pPr>
+            <w:r>
+              <w:rPr>
+                <w:rFonts w:ascii="Calibri" w:cs="Calibri" w:eastAsia="Calibri" w:hAnsi="Calibri"/>
+                <w:b w:val="false"/>
+                <w:bCs w:val="false"/>
+                <w:color w:val="22302A"/>
+                <w:sz w:val="20"/>
+                <w:szCs w:val="20"/>
+              </w:rPr>
+              <w:t xml:space="preserve">description</w:t>
+            </w:r>
+          </w:p>
+        </w:tc>
+        <w:tc>
+          <w:tcPr>
+            <w:tcW w:type="dxa" w:w="2805"/>
+            <w:tcMar>
+              <w:top w:type="dxa" w:w="100"/>
+              <w:left w:type="dxa" w:w="120"/>
+              <w:bottom w:type="dxa" w:w="100"/>
+              <w:right w:type="dxa" w:w="120"/>
+            </w:tcMar>
+            <w:vAlign w:val="center"/>
+          </w:tcPr>
+          <w:p>
+            <w:pPr>
+              <w:jc w:val="left"/>
+            </w:pPr>
+            <w:r>
+              <w:rPr>
+                <w:rFonts w:ascii="Calibri" w:cs="Calibri" w:eastAsia="Calibri" w:hAnsi="Calibri"/>
+                <w:b w:val="false"/>
+                <w:bCs w:val="false"/>
+                <w:color w:val="22302A"/>
+                <w:sz w:val="20"/>
+                <w:szCs w:val="20"/>
+              </w:rPr>
+              <w:t xml:space="preserve">TEXT</w:t>
+            </w:r>
+          </w:p>
+        </w:tc>
+        <w:tc>
+          <w:tcPr>
+            <w:tcW w:type="dxa" w:w="4488"/>
+            <w:tcMar>
+              <w:top w:type="dxa" w:w="100"/>
+              <w:left w:type="dxa" w:w="120"/>
+              <w:bottom w:type="dxa" w:w="100"/>
+              <w:right w:type="dxa" w:w="120"/>
+            </w:tcMar>
+            <w:vAlign w:val="center"/>
+          </w:tcPr>
+          <w:p>
+            <w:pPr>
+              <w:jc w:val="left"/>
+            </w:pPr>
+            <w:r>
+              <w:rPr>
+                <w:rFonts w:ascii="Calibri" w:cs="Calibri" w:eastAsia="Calibri" w:hAnsi="Calibri"/>
+                <w:b w:val="false"/>
+                <w:bCs w:val="false"/>
+                <w:color w:val="22302A"/>
+                <w:sz w:val="20"/>
+                <w:szCs w:val="20"/>
+              </w:rPr>
+              <w:t xml:space="preserve">Mô tả ngắn hiển thị trên thẻ (mục 7.6/7.7).</w:t>
+            </w:r>
+          </w:p>
+        </w:tc>
+      </w:tr>
+      <w:tr>
+        <w:tc>
+          <w:tcPr>
+            <w:tcW w:type="dxa" w:w="2057"/>
+            <w:shd w:fill="F4F4F2" w:val="clear"/>
+            <w:tcMar>
+              <w:top w:type="dxa" w:w="100"/>
+              <w:left w:type="dxa" w:w="120"/>
+              <w:bottom w:type="dxa" w:w="100"/>
+              <w:right w:type="dxa" w:w="120"/>
+            </w:tcMar>
+            <w:vAlign w:val="center"/>
+          </w:tcPr>
+          <w:p>
+            <w:pPr>
+              <w:jc w:val="left"/>
+            </w:pPr>
+            <w:r>
+              <w:rPr>
+                <w:rFonts w:ascii="Calibri" w:cs="Calibri" w:eastAsia="Calibri" w:hAnsi="Calibri"/>
+                <w:b w:val="false"/>
+                <w:bCs w:val="false"/>
+                <w:color w:val="22302A"/>
+                <w:sz w:val="20"/>
+                <w:szCs w:val="20"/>
+              </w:rPr>
+              <w:t xml:space="preserve">sort_order</w:t>
+            </w:r>
+          </w:p>
+        </w:tc>
+        <w:tc>
+          <w:tcPr>
+            <w:tcW w:type="dxa" w:w="2805"/>
+            <w:shd w:fill="F4F4F2" w:val="clear"/>
+            <w:tcMar>
+              <w:top w:type="dxa" w:w="100"/>
+              <w:left w:type="dxa" w:w="120"/>
+              <w:bottom w:type="dxa" w:w="100"/>
+              <w:right w:type="dxa" w:w="120"/>
+            </w:tcMar>
+            <w:vAlign w:val="center"/>
+          </w:tcPr>
+          <w:p>
+            <w:pPr>
+              <w:jc w:val="left"/>
+            </w:pPr>
+            <w:r>
+              <w:rPr>
+                <w:rFonts w:ascii="Calibri" w:cs="Calibri" w:eastAsia="Calibri" w:hAnsi="Calibri"/>
+                <w:b w:val="false"/>
+                <w:bCs w:val="false"/>
+                <w:color w:val="22302A"/>
+                <w:sz w:val="20"/>
+                <w:szCs w:val="20"/>
+              </w:rPr>
+              <w:t xml:space="preserve">INTEGER</w:t>
+            </w:r>
+          </w:p>
+        </w:tc>
+        <w:tc>
+          <w:tcPr>
+            <w:tcW w:type="dxa" w:w="4488"/>
+            <w:shd w:fill="F4F4F2" w:val="clear"/>
+            <w:tcMar>
+              <w:top w:type="dxa" w:w="100"/>
+              <w:left w:type="dxa" w:w="120"/>
+              <w:bottom w:type="dxa" w:w="100"/>
+              <w:right w:type="dxa" w:w="120"/>
+            </w:tcMar>
+            <w:vAlign w:val="center"/>
+          </w:tcPr>
+          <w:p>
+            <w:pPr>
+              <w:jc w:val="left"/>
+            </w:pPr>
+            <w:r>
+              <w:rPr>
+                <w:rFonts w:ascii="Calibri" w:cs="Calibri" w:eastAsia="Calibri" w:hAnsi="Calibri"/>
+                <w:b w:val="false"/>
+                <w:bCs w:val="false"/>
+                <w:color w:val="22302A"/>
+                <w:sz w:val="20"/>
+                <w:szCs w:val="20"/>
+              </w:rPr>
+              <w:t xml:space="preserve">Thứ tự hiển thị do Admin sắp xếp tay.</w:t>
+            </w:r>
+          </w:p>
+        </w:tc>
+      </w:tr>
+      <w:tr>
+        <w:tc>
+          <w:tcPr>
+            <w:tcW w:type="dxa" w:w="2057"/>
+            <w:tcMar>
+              <w:top w:type="dxa" w:w="100"/>
+              <w:left w:type="dxa" w:w="120"/>
+              <w:bottom w:type="dxa" w:w="100"/>
+              <w:right w:type="dxa" w:w="120"/>
+            </w:tcMar>
+            <w:vAlign w:val="center"/>
+          </w:tcPr>
+          <w:p>
+            <w:pPr>
+              <w:jc w:val="left"/>
+            </w:pPr>
+            <w:r>
+              <w:rPr>
+                <w:rFonts w:ascii="Calibri" w:cs="Calibri" w:eastAsia="Calibri" w:hAnsi="Calibri"/>
+                <w:b w:val="false"/>
+                <w:bCs w:val="false"/>
+                <w:color w:val="22302A"/>
+                <w:sz w:val="20"/>
+                <w:szCs w:val="20"/>
+              </w:rPr>
+              <w:t xml:space="preserve">is_active</w:t>
+            </w:r>
+          </w:p>
+        </w:tc>
+        <w:tc>
+          <w:tcPr>
+            <w:tcW w:type="dxa" w:w="2805"/>
+            <w:tcMar>
+              <w:top w:type="dxa" w:w="100"/>
+              <w:left w:type="dxa" w:w="120"/>
+              <w:bottom w:type="dxa" w:w="100"/>
+              <w:right w:type="dxa" w:w="120"/>
+            </w:tcMar>
+            <w:vAlign w:val="center"/>
+          </w:tcPr>
+          <w:p>
+            <w:pPr>
+              <w:jc w:val="left"/>
+            </w:pPr>
+            <w:r>
+              <w:rPr>
+                <w:rFonts w:ascii="Calibri" w:cs="Calibri" w:eastAsia="Calibri" w:hAnsi="Calibri"/>
+                <w:b w:val="false"/>
+                <w:bCs w:val="false"/>
+                <w:color w:val="22302A"/>
+                <w:sz w:val="20"/>
+                <w:szCs w:val="20"/>
+              </w:rPr>
+              <w:t xml:space="preserve">BOOLEAN DEFAULT true</w:t>
+            </w:r>
+          </w:p>
+        </w:tc>
+        <w:tc>
+          <w:tcPr>
+            <w:tcW w:type="dxa" w:w="4488"/>
+            <w:tcMar>
+              <w:top w:type="dxa" w:w="100"/>
+              <w:left w:type="dxa" w:w="120"/>
+              <w:bottom w:type="dxa" w:w="100"/>
+              <w:right w:type="dxa" w:w="120"/>
+            </w:tcMar>
+            <w:vAlign w:val="center"/>
+          </w:tcPr>
+          <w:p>
+            <w:pPr>
+              <w:jc w:val="left"/>
+            </w:pPr>
+            <w:r>
+              <w:rPr>
+                <w:rFonts w:ascii="Calibri" w:cs="Calibri" w:eastAsia="Calibri" w:hAnsi="Calibri"/>
+                <w:b w:val="false"/>
+                <w:bCs w:val="false"/>
+                <w:color w:val="22302A"/>
+                <w:sz w:val="20"/>
+                <w:szCs w:val="20"/>
+              </w:rPr>
+              <w:t xml:space="preserve">Ẩn/hiện tạm thời — không dùng xoá cứng cho danh mục dùng chung.</w:t>
+            </w:r>
+          </w:p>
+        </w:tc>
+      </w:tr>
+    </w:tbl>
+    <w:p>
+      <w:pPr>
+        <w:pStyle w:val="Heading3"/>
+        <w:spacing w:after="100" w:before="220"/>
+      </w:pPr>
+      <w:r>
+        <w:rPr>
+          <w:rFonts w:ascii="Calibri" w:cs="Calibri" w:eastAsia="Calibri" w:hAnsi="Calibri"/>
+          <w:b/>
+          <w:bCs/>
+          <w:color w:val="2FA968"/>
+        </w:rPr>
+        <w:t xml:space="preserve">doctors / doctor_schedules</w:t>
+      </w:r>
+    </w:p>
+    <w:tbl>
+      <w:tblPr>
+        <w:tblW w:type="dxa" w:w="9350"/>
+        <w:tblBorders>
+          <w:top w:val="single" w:color="auto" w:sz="4"/>
+          <w:left w:val="single" w:color="auto" w:sz="4"/>
+          <w:bottom w:val="single" w:color="auto" w:sz="4"/>
+          <w:right w:val="single" w:color="auto" w:sz="4"/>
+          <w:insideH w:val="single" w:color="auto" w:sz="4"/>
+          <w:insideV w:val="single" w:color="auto" w:sz="4"/>
+        </w:tblBorders>
+      </w:tblPr>
+      <w:tblGrid>
+        <w:gridCol w:w="2431"/>
+        <w:gridCol w:w="2805"/>
+        <w:gridCol w:w="4114"/>
+      </w:tblGrid>
+      <w:tr>
+        <w:trPr>
+          <w:tblHeader/>
+        </w:trPr>
+        <w:tc>
+          <w:tcPr>
+            <w:tcW w:type="dxa" w:w="2431"/>
+            <w:shd w:fill="164B36" w:val="clear"/>
+            <w:tcMar>
+              <w:top w:type="dxa" w:w="100"/>
+              <w:left w:type="dxa" w:w="120"/>
+              <w:bottom w:type="dxa" w:w="100"/>
+              <w:right w:type="dxa" w:w="120"/>
+            </w:tcMar>
+            <w:vAlign w:val="center"/>
+          </w:tcPr>
+          <w:p>
+            <w:pPr>
+              <w:jc w:val="left"/>
+            </w:pPr>
+            <w:r>
+              <w:rPr>
+                <w:rFonts w:ascii="Calibri" w:cs="Calibri" w:eastAsia="Calibri" w:hAnsi="Calibri"/>
+                <w:b/>
+                <w:bCs/>
+                <w:color w:val="FFFFFF"/>
+                <w:sz w:val="19"/>
+                <w:szCs w:val="19"/>
+              </w:rPr>
+              <w:t xml:space="preserve">Trường</w:t>
+            </w:r>
+          </w:p>
+        </w:tc>
+        <w:tc>
+          <w:tcPr>
+            <w:tcW w:type="dxa" w:w="2805"/>
+            <w:shd w:fill="164B36" w:val="clear"/>
+            <w:tcMar>
+              <w:top w:type="dxa" w:w="100"/>
+              <w:left w:type="dxa" w:w="120"/>
+              <w:bottom w:type="dxa" w:w="100"/>
+              <w:right w:type="dxa" w:w="120"/>
+            </w:tcMar>
+            <w:vAlign w:val="center"/>
+          </w:tcPr>
+          <w:p>
+            <w:pPr>
+              <w:jc w:val="left"/>
+            </w:pPr>
+            <w:r>
+              <w:rPr>
+                <w:rFonts w:ascii="Calibri" w:cs="Calibri" w:eastAsia="Calibri" w:hAnsi="Calibri"/>
+                <w:b/>
+                <w:bCs/>
+                <w:color w:val="FFFFFF"/>
+                <w:sz w:val="19"/>
+                <w:szCs w:val="19"/>
+              </w:rPr>
+              <w:t xml:space="preserve">Kiểu dữ liệu</w:t>
+            </w:r>
+          </w:p>
+        </w:tc>
+        <w:tc>
+          <w:tcPr>
+            <w:tcW w:type="dxa" w:w="4114"/>
+            <w:shd w:fill="164B36" w:val="clear"/>
+            <w:tcMar>
+              <w:top w:type="dxa" w:w="100"/>
+              <w:left w:type="dxa" w:w="120"/>
+              <w:bottom w:type="dxa" w:w="100"/>
+              <w:right w:type="dxa" w:w="120"/>
+            </w:tcMar>
+            <w:vAlign w:val="center"/>
+          </w:tcPr>
+          <w:p>
+            <w:pPr>
+              <w:jc w:val="left"/>
+            </w:pPr>
+            <w:r>
+              <w:rPr>
+                <w:rFonts w:ascii="Calibri" w:cs="Calibri" w:eastAsia="Calibri" w:hAnsi="Calibri"/>
+                <w:b/>
+                <w:bCs/>
+                <w:color w:val="FFFFFF"/>
+                <w:sz w:val="19"/>
+                <w:szCs w:val="19"/>
+              </w:rPr>
+              <w:t xml:space="preserve">Ghi chú</w:t>
+            </w:r>
+          </w:p>
+        </w:tc>
+      </w:tr>
+      <w:tr>
+        <w:tc>
+          <w:tcPr>
+            <w:tcW w:type="dxa" w:w="2431"/>
+            <w:tcMar>
+              <w:top w:type="dxa" w:w="100"/>
+              <w:left w:type="dxa" w:w="120"/>
+              <w:bottom w:type="dxa" w:w="100"/>
+              <w:right w:type="dxa" w:w="120"/>
+            </w:tcMar>
+            <w:vAlign w:val="center"/>
+          </w:tcPr>
+          <w:p>
+            <w:pPr>
+              <w:jc w:val="left"/>
+            </w:pPr>
+            <w:r>
+              <w:rPr>
+                <w:rFonts w:ascii="Calibri" w:cs="Calibri" w:eastAsia="Calibri" w:hAnsi="Calibri"/>
+                <w:b w:val="false"/>
+                <w:bCs w:val="false"/>
+                <w:color w:val="22302A"/>
+                <w:sz w:val="20"/>
+                <w:szCs w:val="20"/>
+              </w:rPr>
+              <w:t xml:space="preserve">id</w:t>
+            </w:r>
+          </w:p>
+        </w:tc>
+        <w:tc>
+          <w:tcPr>
+            <w:tcW w:type="dxa" w:w="2805"/>
+            <w:tcMar>
+              <w:top w:type="dxa" w:w="100"/>
+              <w:left w:type="dxa" w:w="120"/>
+              <w:bottom w:type="dxa" w:w="100"/>
+              <w:right w:type="dxa" w:w="120"/>
+            </w:tcMar>
+            <w:vAlign w:val="center"/>
+          </w:tcPr>
+          <w:p>
+            <w:pPr>
+              <w:jc w:val="left"/>
+            </w:pPr>
+            <w:r>
+              <w:rPr>
+                <w:rFonts w:ascii="Calibri" w:cs="Calibri" w:eastAsia="Calibri" w:hAnsi="Calibri"/>
+                <w:b w:val="false"/>
+                <w:bCs w:val="false"/>
+                <w:color w:val="22302A"/>
+                <w:sz w:val="20"/>
+                <w:szCs w:val="20"/>
+              </w:rPr>
+              <w:t xml:space="preserve">UUID (PK)</w:t>
+            </w:r>
+          </w:p>
+        </w:tc>
+        <w:tc>
+          <w:tcPr>
+            <w:tcW w:type="dxa" w:w="4114"/>
+            <w:tcMar>
+              <w:top w:type="dxa" w:w="100"/>
+              <w:left w:type="dxa" w:w="120"/>
+              <w:bottom w:type="dxa" w:w="100"/>
+              <w:right w:type="dxa" w:w="120"/>
+            </w:tcMar>
+            <w:vAlign w:val="center"/>
+          </w:tcPr>
+          <w:p>
+            <w:pPr>
+              <w:jc w:val="left"/>
+            </w:pPr>
+            <w:r>
+              <w:rPr>
+                <w:rFonts w:ascii="Calibri" w:cs="Calibri" w:eastAsia="Calibri" w:hAnsi="Calibri"/>
+                <w:b w:val="false"/>
+                <w:bCs w:val="false"/>
+                <w:color w:val="22302A"/>
+                <w:sz w:val="20"/>
+                <w:szCs w:val="20"/>
+              </w:rPr>
+              <w:t xml:space="preserve">Khoá chính bảng doctors.</w:t>
+            </w:r>
+          </w:p>
+        </w:tc>
+      </w:tr>
+      <w:tr>
+        <w:tc>
+          <w:tcPr>
+            <w:tcW w:type="dxa" w:w="2431"/>
+            <w:shd w:fill="F4F4F2" w:val="clear"/>
+            <w:tcMar>
+              <w:top w:type="dxa" w:w="100"/>
+              <w:left w:type="dxa" w:w="120"/>
+              <w:bottom w:type="dxa" w:w="100"/>
+              <w:right w:type="dxa" w:w="120"/>
+            </w:tcMar>
+            <w:vAlign w:val="center"/>
+          </w:tcPr>
+          <w:p>
+            <w:pPr>
+              <w:jc w:val="left"/>
+            </w:pPr>
+            <w:r>
+              <w:rPr>
+                <w:rFonts w:ascii="Calibri" w:cs="Calibri" w:eastAsia="Calibri" w:hAnsi="Calibri"/>
+                <w:b w:val="false"/>
+                <w:bCs w:val="false"/>
+                <w:color w:val="22302A"/>
+                <w:sz w:val="20"/>
+                <w:szCs w:val="20"/>
+              </w:rPr>
+              <w:t xml:space="preserve">full_name / degree</w:t>
+            </w:r>
+          </w:p>
+        </w:tc>
+        <w:tc>
+          <w:tcPr>
+            <w:tcW w:type="dxa" w:w="2805"/>
+            <w:shd w:fill="F4F4F2" w:val="clear"/>
+            <w:tcMar>
+              <w:top w:type="dxa" w:w="100"/>
+              <w:left w:type="dxa" w:w="120"/>
+              <w:bottom w:type="dxa" w:w="100"/>
+              <w:right w:type="dxa" w:w="120"/>
+            </w:tcMar>
+            <w:vAlign w:val="center"/>
+          </w:tcPr>
+          <w:p>
+            <w:pPr>
+              <w:jc w:val="left"/>
+            </w:pPr>
+            <w:r>
+              <w:rPr>
+                <w:rFonts w:ascii="Calibri" w:cs="Calibri" w:eastAsia="Calibri" w:hAnsi="Calibri"/>
+                <w:b w:val="false"/>
+                <w:bCs w:val="false"/>
+                <w:color w:val="22302A"/>
+                <w:sz w:val="20"/>
+                <w:szCs w:val="20"/>
+              </w:rPr>
+              <w:t xml:space="preserve">VARCHAR(150) / VARCHAR(100)</w:t>
+            </w:r>
+          </w:p>
+        </w:tc>
+        <w:tc>
+          <w:tcPr>
+            <w:tcW w:type="dxa" w:w="4114"/>
+            <w:shd w:fill="F4F4F2" w:val="clear"/>
+            <w:tcMar>
+              <w:top w:type="dxa" w:w="100"/>
+              <w:left w:type="dxa" w:w="120"/>
+              <w:bottom w:type="dxa" w:w="100"/>
+              <w:right w:type="dxa" w:w="120"/>
+            </w:tcMar>
+            <w:vAlign w:val="center"/>
+          </w:tcPr>
+          <w:p>
+            <w:pPr>
+              <w:jc w:val="left"/>
+            </w:pPr>
+            <w:r>
+              <w:rPr>
+                <w:rFonts w:ascii="Calibri" w:cs="Calibri" w:eastAsia="Calibri" w:hAnsi="Calibri"/>
+                <w:b w:val="false"/>
+                <w:bCs w:val="false"/>
+                <w:color w:val="22302A"/>
+                <w:sz w:val="20"/>
+                <w:szCs w:val="20"/>
+              </w:rPr>
+              <w:t xml:space="preserve">Họ tên, học hàm/học vị hiển thị (mục 7.8).</w:t>
+            </w:r>
+          </w:p>
+        </w:tc>
+      </w:tr>
+      <w:tr>
+        <w:tc>
+          <w:tcPr>
+            <w:tcW w:type="dxa" w:w="2431"/>
+            <w:tcMar>
+              <w:top w:type="dxa" w:w="100"/>
+              <w:left w:type="dxa" w:w="120"/>
+              <w:bottom w:type="dxa" w:w="100"/>
+              <w:right w:type="dxa" w:w="120"/>
+            </w:tcMar>
+            <w:vAlign w:val="center"/>
+          </w:tcPr>
+          <w:p>
+            <w:pPr>
+              <w:jc w:val="left"/>
+            </w:pPr>
+            <w:r>
+              <w:rPr>
+                <w:rFonts w:ascii="Calibri" w:cs="Calibri" w:eastAsia="Calibri" w:hAnsi="Calibri"/>
+                <w:b w:val="false"/>
+                <w:bCs w:val="false"/>
+                <w:color w:val="22302A"/>
+                <w:sz w:val="20"/>
+                <w:szCs w:val="20"/>
+              </w:rPr>
+              <w:t xml:space="preserve">specialty_id</w:t>
+            </w:r>
+          </w:p>
+        </w:tc>
+        <w:tc>
+          <w:tcPr>
+            <w:tcW w:type="dxa" w:w="2805"/>
+            <w:tcMar>
+              <w:top w:type="dxa" w:w="100"/>
+              <w:left w:type="dxa" w:w="120"/>
+              <w:bottom w:type="dxa" w:w="100"/>
+              <w:right w:type="dxa" w:w="120"/>
+            </w:tcMar>
+            <w:vAlign w:val="center"/>
+          </w:tcPr>
+          <w:p>
+            <w:pPr>
+              <w:jc w:val="left"/>
+            </w:pPr>
+            <w:r>
+              <w:rPr>
+                <w:rFonts w:ascii="Calibri" w:cs="Calibri" w:eastAsia="Calibri" w:hAnsi="Calibri"/>
+                <w:b w:val="false"/>
+                <w:bCs w:val="false"/>
+                <w:color w:val="22302A"/>
+                <w:sz w:val="20"/>
+                <w:szCs w:val="20"/>
+              </w:rPr>
+              <w:t xml:space="preserve">UUID (FK → specialties.id)</w:t>
+            </w:r>
+          </w:p>
+        </w:tc>
+        <w:tc>
+          <w:tcPr>
+            <w:tcW w:type="dxa" w:w="4114"/>
+            <w:tcMar>
+              <w:top w:type="dxa" w:w="100"/>
+              <w:left w:type="dxa" w:w="120"/>
+              <w:bottom w:type="dxa" w:w="100"/>
+              <w:right w:type="dxa" w:w="120"/>
+            </w:tcMar>
+            <w:vAlign w:val="center"/>
+          </w:tcPr>
+          <w:p>
+            <w:pPr>
+              <w:jc w:val="left"/>
+            </w:pPr>
+            <w:r>
+              <w:rPr>
+                <w:rFonts w:ascii="Calibri" w:cs="Calibri" w:eastAsia="Calibri" w:hAnsi="Calibri"/>
+                <w:b w:val="false"/>
+                <w:bCs w:val="false"/>
+                <w:color w:val="22302A"/>
+                <w:sz w:val="20"/>
+                <w:szCs w:val="20"/>
+              </w:rPr>
+              <w:t xml:space="preserve">Chuyên khoa phụ trách.</w:t>
+            </w:r>
+          </w:p>
+        </w:tc>
+      </w:tr>
+      <w:tr>
+        <w:tc>
+          <w:tcPr>
+            <w:tcW w:type="dxa" w:w="2431"/>
+            <w:shd w:fill="F4F4F2" w:val="clear"/>
+            <w:tcMar>
+              <w:top w:type="dxa" w:w="100"/>
+              <w:left w:type="dxa" w:w="120"/>
+              <w:bottom w:type="dxa" w:w="100"/>
+              <w:right w:type="dxa" w:w="120"/>
+            </w:tcMar>
+            <w:vAlign w:val="center"/>
+          </w:tcPr>
+          <w:p>
+            <w:pPr>
+              <w:jc w:val="left"/>
+            </w:pPr>
+            <w:r>
+              <w:rPr>
+                <w:rFonts w:ascii="Calibri" w:cs="Calibri" w:eastAsia="Calibri" w:hAnsi="Calibri"/>
+                <w:b w:val="false"/>
+                <w:bCs w:val="false"/>
+                <w:color w:val="22302A"/>
+                <w:sz w:val="20"/>
+                <w:szCs w:val="20"/>
+              </w:rPr>
+              <w:t xml:space="preserve">bio</w:t>
+            </w:r>
+          </w:p>
+        </w:tc>
+        <w:tc>
+          <w:tcPr>
+            <w:tcW w:type="dxa" w:w="2805"/>
+            <w:shd w:fill="F4F4F2" w:val="clear"/>
+            <w:tcMar>
+              <w:top w:type="dxa" w:w="100"/>
+              <w:left w:type="dxa" w:w="120"/>
+              <w:bottom w:type="dxa" w:w="100"/>
+              <w:right w:type="dxa" w:w="120"/>
+            </w:tcMar>
+            <w:vAlign w:val="center"/>
+          </w:tcPr>
+          <w:p>
+            <w:pPr>
+              <w:jc w:val="left"/>
+            </w:pPr>
+            <w:r>
+              <w:rPr>
+                <w:rFonts w:ascii="Calibri" w:cs="Calibri" w:eastAsia="Calibri" w:hAnsi="Calibri"/>
+                <w:b w:val="false"/>
+                <w:bCs w:val="false"/>
+                <w:color w:val="22302A"/>
+                <w:sz w:val="20"/>
+                <w:szCs w:val="20"/>
+              </w:rPr>
+              <w:t xml:space="preserve">TEXT</w:t>
+            </w:r>
+          </w:p>
+        </w:tc>
+        <w:tc>
+          <w:tcPr>
+            <w:tcW w:type="dxa" w:w="4114"/>
+            <w:shd w:fill="F4F4F2" w:val="clear"/>
+            <w:tcMar>
+              <w:top w:type="dxa" w:w="100"/>
+              <w:left w:type="dxa" w:w="120"/>
+              <w:bottom w:type="dxa" w:w="100"/>
+              <w:right w:type="dxa" w:w="120"/>
+            </w:tcMar>
+            <w:vAlign w:val="center"/>
+          </w:tcPr>
+          <w:p>
+            <w:pPr>
+              <w:jc w:val="left"/>
+            </w:pPr>
+            <w:r>
+              <w:rPr>
+                <w:rFonts w:ascii="Calibri" w:cs="Calibri" w:eastAsia="Calibri" w:hAnsi="Calibri"/>
+                <w:b w:val="false"/>
+                <w:bCs w:val="false"/>
+                <w:color w:val="22302A"/>
+                <w:sz w:val="20"/>
+                <w:szCs w:val="20"/>
+              </w:rPr>
+              <w:t xml:space="preserve">Giới thiệu, kinh nghiệm — tab “Giới thiệu/Kinh nghiệm” mục 8.3 (C3).</w:t>
+            </w:r>
+          </w:p>
+        </w:tc>
+      </w:tr>
+      <w:tr>
+        <w:tc>
+          <w:tcPr>
+            <w:tcW w:type="dxa" w:w="2431"/>
+            <w:tcMar>
+              <w:top w:type="dxa" w:w="100"/>
+              <w:left w:type="dxa" w:w="120"/>
+              <w:bottom w:type="dxa" w:w="100"/>
+              <w:right w:type="dxa" w:w="120"/>
+            </w:tcMar>
+            <w:vAlign w:val="center"/>
+          </w:tcPr>
+          <w:p>
+            <w:pPr>
+              <w:jc w:val="left"/>
+            </w:pPr>
+            <w:r>
+              <w:rPr>
+                <w:rFonts w:ascii="Calibri" w:cs="Calibri" w:eastAsia="Calibri" w:hAnsi="Calibri"/>
+                <w:b w:val="false"/>
+                <w:bCs w:val="false"/>
+                <w:color w:val="22302A"/>
+                <w:sz w:val="20"/>
+                <w:szCs w:val="20"/>
+              </w:rPr>
+              <w:t xml:space="preserve">avatar_url</w:t>
+            </w:r>
+          </w:p>
+        </w:tc>
+        <w:tc>
+          <w:tcPr>
+            <w:tcW w:type="dxa" w:w="2805"/>
+            <w:tcMar>
+              <w:top w:type="dxa" w:w="100"/>
+              <w:left w:type="dxa" w:w="120"/>
+              <w:bottom w:type="dxa" w:w="100"/>
+              <w:right w:type="dxa" w:w="120"/>
+            </w:tcMar>
+            <w:vAlign w:val="center"/>
+          </w:tcPr>
+          <w:p>
+            <w:pPr>
+              <w:jc w:val="left"/>
+            </w:pPr>
+            <w:r>
+              <w:rPr>
+                <w:rFonts w:ascii="Calibri" w:cs="Calibri" w:eastAsia="Calibri" w:hAnsi="Calibri"/>
+                <w:b w:val="false"/>
+                <w:bCs w:val="false"/>
+                <w:color w:val="22302A"/>
+                <w:sz w:val="20"/>
+                <w:szCs w:val="20"/>
+              </w:rPr>
+              <w:t xml:space="preserve">VARCHAR(255)</w:t>
+            </w:r>
+          </w:p>
+        </w:tc>
+        <w:tc>
+          <w:tcPr>
+            <w:tcW w:type="dxa" w:w="4114"/>
+            <w:tcMar>
+              <w:top w:type="dxa" w:w="100"/>
+              <w:left w:type="dxa" w:w="120"/>
+              <w:bottom w:type="dxa" w:w="100"/>
+              <w:right w:type="dxa" w:w="120"/>
+            </w:tcMar>
+            <w:vAlign w:val="center"/>
+          </w:tcPr>
+          <w:p>
+            <w:pPr>
+              <w:jc w:val="left"/>
+            </w:pPr>
+            <w:r>
+              <w:rPr>
+                <w:rFonts w:ascii="Calibri" w:cs="Calibri" w:eastAsia="Calibri" w:hAnsi="Calibri"/>
+                <w:b w:val="false"/>
+                <w:bCs w:val="false"/>
+                <w:color w:val="22302A"/>
+                <w:sz w:val="20"/>
+                <w:szCs w:val="20"/>
+              </w:rPr>
+              <w:t xml:space="preserve">Ảnh chân dung.</w:t>
+            </w:r>
+          </w:p>
+        </w:tc>
+      </w:tr>
+      <w:tr>
+        <w:tc>
+          <w:tcPr>
+            <w:tcW w:type="dxa" w:w="2431"/>
+            <w:shd w:fill="F4F4F2" w:val="clear"/>
+            <w:tcMar>
+              <w:top w:type="dxa" w:w="100"/>
+              <w:left w:type="dxa" w:w="120"/>
+              <w:bottom w:type="dxa" w:w="100"/>
+              <w:right w:type="dxa" w:w="120"/>
+            </w:tcMar>
+            <w:vAlign w:val="center"/>
+          </w:tcPr>
+          <w:p>
+            <w:pPr>
+              <w:jc w:val="left"/>
+            </w:pPr>
+            <w:r>
+              <w:rPr>
+                <w:rFonts w:ascii="Calibri" w:cs="Calibri" w:eastAsia="Calibri" w:hAnsi="Calibri"/>
+                <w:b w:val="false"/>
+                <w:bCs w:val="false"/>
+                <w:color w:val="22302A"/>
+                <w:sz w:val="20"/>
+                <w:szCs w:val="20"/>
+              </w:rPr>
+              <w:t xml:space="preserve">is_featured</w:t>
+            </w:r>
+          </w:p>
+        </w:tc>
+        <w:tc>
+          <w:tcPr>
+            <w:tcW w:type="dxa" w:w="2805"/>
+            <w:shd w:fill="F4F4F2" w:val="clear"/>
+            <w:tcMar>
+              <w:top w:type="dxa" w:w="100"/>
+              <w:left w:type="dxa" w:w="120"/>
+              <w:bottom w:type="dxa" w:w="100"/>
+              <w:right w:type="dxa" w:w="120"/>
+            </w:tcMar>
+            <w:vAlign w:val="center"/>
+          </w:tcPr>
+          <w:p>
+            <w:pPr>
+              <w:jc w:val="left"/>
+            </w:pPr>
+            <w:r>
+              <w:rPr>
+                <w:rFonts w:ascii="Calibri" w:cs="Calibri" w:eastAsia="Calibri" w:hAnsi="Calibri"/>
+                <w:b w:val="false"/>
+                <w:bCs w:val="false"/>
+                <w:color w:val="22302A"/>
+                <w:sz w:val="20"/>
+                <w:szCs w:val="20"/>
+              </w:rPr>
+              <w:t xml:space="preserve">BOOLEAN DEFAULT false</w:t>
+            </w:r>
+          </w:p>
+        </w:tc>
+        <w:tc>
+          <w:tcPr>
+            <w:tcW w:type="dxa" w:w="4114"/>
+            <w:shd w:fill="F4F4F2" w:val="clear"/>
+            <w:tcMar>
+              <w:top w:type="dxa" w:w="100"/>
+              <w:left w:type="dxa" w:w="120"/>
+              <w:bottom w:type="dxa" w:w="100"/>
+              <w:right w:type="dxa" w:w="120"/>
+            </w:tcMar>
+            <w:vAlign w:val="center"/>
+          </w:tcPr>
+          <w:p>
+            <w:pPr>
+              <w:jc w:val="left"/>
+            </w:pPr>
+            <w:r>
+              <w:rPr>
+                <w:rFonts w:ascii="Calibri" w:cs="Calibri" w:eastAsia="Calibri" w:hAnsi="Calibri"/>
+                <w:b w:val="false"/>
+                <w:bCs w:val="false"/>
+                <w:color w:val="22302A"/>
+                <w:sz w:val="20"/>
+                <w:szCs w:val="20"/>
+              </w:rPr>
+              <w:t xml:space="preserve">Đánh dấu hiển thị ở trang chủ mục 7.8.</w:t>
+            </w:r>
+          </w:p>
+        </w:tc>
+      </w:tr>
+      <w:tr>
+        <w:tc>
+          <w:tcPr>
+            <w:tcW w:type="dxa" w:w="2431"/>
+            <w:tcMar>
+              <w:top w:type="dxa" w:w="100"/>
+              <w:left w:type="dxa" w:w="120"/>
+              <w:bottom w:type="dxa" w:w="100"/>
+              <w:right w:type="dxa" w:w="120"/>
+            </w:tcMar>
+            <w:vAlign w:val="center"/>
+          </w:tcPr>
+          <w:p>
+            <w:pPr>
+              <w:jc w:val="left"/>
+            </w:pPr>
+            <w:r>
+              <w:rPr>
+                <w:rFonts w:ascii="Calibri" w:cs="Calibri" w:eastAsia="Calibri" w:hAnsi="Calibri"/>
+                <w:b w:val="false"/>
+                <w:bCs w:val="false"/>
+                <w:color w:val="22302A"/>
+                <w:sz w:val="20"/>
+                <w:szCs w:val="20"/>
+              </w:rPr>
+              <w:t xml:space="preserve">doctor_schedules.doctor_id</w:t>
+            </w:r>
+          </w:p>
+        </w:tc>
+        <w:tc>
+          <w:tcPr>
+            <w:tcW w:type="dxa" w:w="2805"/>
+            <w:tcMar>
+              <w:top w:type="dxa" w:w="100"/>
+              <w:left w:type="dxa" w:w="120"/>
+              <w:bottom w:type="dxa" w:w="100"/>
+              <w:right w:type="dxa" w:w="120"/>
+            </w:tcMar>
+            <w:vAlign w:val="center"/>
+          </w:tcPr>
+          <w:p>
+            <w:pPr>
+              <w:jc w:val="left"/>
+            </w:pPr>
+            <w:r>
+              <w:rPr>
+                <w:rFonts w:ascii="Calibri" w:cs="Calibri" w:eastAsia="Calibri" w:hAnsi="Calibri"/>
+                <w:b w:val="false"/>
+                <w:bCs w:val="false"/>
+                <w:color w:val="22302A"/>
+                <w:sz w:val="20"/>
+                <w:szCs w:val="20"/>
+              </w:rPr>
+              <w:t xml:space="preserve">UUID (FK → doctors.id)</w:t>
+            </w:r>
+          </w:p>
+        </w:tc>
+        <w:tc>
+          <w:tcPr>
+            <w:tcW w:type="dxa" w:w="4114"/>
+            <w:tcMar>
+              <w:top w:type="dxa" w:w="100"/>
+              <w:left w:type="dxa" w:w="120"/>
+              <w:bottom w:type="dxa" w:w="100"/>
+              <w:right w:type="dxa" w:w="120"/>
+            </w:tcMar>
+            <w:vAlign w:val="center"/>
+          </w:tcPr>
+          <w:p>
+            <w:pPr>
+              <w:jc w:val="left"/>
+            </w:pPr>
+            <w:r>
+              <w:rPr>
+                <w:rFonts w:ascii="Calibri" w:cs="Calibri" w:eastAsia="Calibri" w:hAnsi="Calibri"/>
+                <w:b w:val="false"/>
+                <w:bCs w:val="false"/>
+                <w:color w:val="22302A"/>
+                <w:sz w:val="20"/>
+                <w:szCs w:val="20"/>
+              </w:rPr>
+              <w:t xml:space="preserve">Bảng riêng — 1 bác sĩ có nhiều dòng lịch.</w:t>
+            </w:r>
+          </w:p>
+        </w:tc>
+      </w:tr>
+      <w:tr>
+        <w:tc>
+          <w:tcPr>
+            <w:tcW w:type="dxa" w:w="2431"/>
+            <w:shd w:fill="F4F4F2" w:val="clear"/>
+            <w:tcMar>
+              <w:top w:type="dxa" w:w="100"/>
+              <w:left w:type="dxa" w:w="120"/>
+              <w:bottom w:type="dxa" w:w="100"/>
+              <w:right w:type="dxa" w:w="120"/>
+            </w:tcMar>
+            <w:vAlign w:val="center"/>
+          </w:tcPr>
+          <w:p>
+            <w:pPr>
+              <w:jc w:val="left"/>
+            </w:pPr>
+            <w:r>
+              <w:rPr>
+                <w:rFonts w:ascii="Calibri" w:cs="Calibri" w:eastAsia="Calibri" w:hAnsi="Calibri"/>
+                <w:b w:val="false"/>
+                <w:bCs w:val="false"/>
+                <w:color w:val="22302A"/>
+                <w:sz w:val="20"/>
+                <w:szCs w:val="20"/>
+              </w:rPr>
+              <w:t xml:space="preserve">doctor_schedules.weekday</w:t>
+            </w:r>
+          </w:p>
+        </w:tc>
+        <w:tc>
+          <w:tcPr>
+            <w:tcW w:type="dxa" w:w="2805"/>
+            <w:shd w:fill="F4F4F2" w:val="clear"/>
+            <w:tcMar>
+              <w:top w:type="dxa" w:w="100"/>
+              <w:left w:type="dxa" w:w="120"/>
+              <w:bottom w:type="dxa" w:w="100"/>
+              <w:right w:type="dxa" w:w="120"/>
+            </w:tcMar>
+            <w:vAlign w:val="center"/>
+          </w:tcPr>
+          <w:p>
+            <w:pPr>
+              <w:jc w:val="left"/>
+            </w:pPr>
+            <w:r>
+              <w:rPr>
+                <w:rFonts w:ascii="Calibri" w:cs="Calibri" w:eastAsia="Calibri" w:hAnsi="Calibri"/>
+                <w:b w:val="false"/>
+                <w:bCs w:val="false"/>
+                <w:color w:val="22302A"/>
+                <w:sz w:val="20"/>
+                <w:szCs w:val="20"/>
+              </w:rPr>
+              <w:t xml:space="preserve">ENUM (T2..CN)</w:t>
+            </w:r>
+          </w:p>
+        </w:tc>
+        <w:tc>
+          <w:tcPr>
+            <w:tcW w:type="dxa" w:w="4114"/>
+            <w:shd w:fill="F4F4F2" w:val="clear"/>
+            <w:tcMar>
+              <w:top w:type="dxa" w:w="100"/>
+              <w:left w:type="dxa" w:w="120"/>
+              <w:bottom w:type="dxa" w:w="100"/>
+              <w:right w:type="dxa" w:w="120"/>
+            </w:tcMar>
+            <w:vAlign w:val="center"/>
+          </w:tcPr>
+          <w:p>
+            <w:pPr>
+              <w:jc w:val="left"/>
+            </w:pPr>
+            <w:r>
+              <w:rPr>
+                <w:rFonts w:ascii="Calibri" w:cs="Calibri" w:eastAsia="Calibri" w:hAnsi="Calibri"/>
+                <w:b w:val="false"/>
+                <w:bCs w:val="false"/>
+                <w:color w:val="22302A"/>
+                <w:sz w:val="20"/>
+                <w:szCs w:val="20"/>
+              </w:rPr>
+              <w:t xml:space="preserve">Ngày trong tuần.</w:t>
+            </w:r>
+          </w:p>
+        </w:tc>
+      </w:tr>
+      <w:tr>
+        <w:tc>
+          <w:tcPr>
+            <w:tcW w:type="dxa" w:w="2431"/>
+            <w:tcMar>
+              <w:top w:type="dxa" w:w="100"/>
+              <w:left w:type="dxa" w:w="120"/>
+              <w:bottom w:type="dxa" w:w="100"/>
+              <w:right w:type="dxa" w:w="120"/>
+            </w:tcMar>
+            <w:vAlign w:val="center"/>
+          </w:tcPr>
+          <w:p>
+            <w:pPr>
+              <w:jc w:val="left"/>
+            </w:pPr>
+            <w:r>
+              <w:rPr>
+                <w:rFonts w:ascii="Calibri" w:cs="Calibri" w:eastAsia="Calibri" w:hAnsi="Calibri"/>
+                <w:b w:val="false"/>
+                <w:bCs w:val="false"/>
+                <w:color w:val="22302A"/>
+                <w:sz w:val="20"/>
+                <w:szCs w:val="20"/>
+              </w:rPr>
+              <w:t xml:space="preserve">doctor_schedules.shift</w:t>
+            </w:r>
+          </w:p>
+        </w:tc>
+        <w:tc>
+          <w:tcPr>
+            <w:tcW w:type="dxa" w:w="2805"/>
+            <w:tcMar>
+              <w:top w:type="dxa" w:w="100"/>
+              <w:left w:type="dxa" w:w="120"/>
+              <w:bottom w:type="dxa" w:w="100"/>
+              <w:right w:type="dxa" w:w="120"/>
+            </w:tcMar>
+            <w:vAlign w:val="center"/>
+          </w:tcPr>
+          <w:p>
+            <w:pPr>
+              <w:jc w:val="left"/>
+            </w:pPr>
+            <w:r>
+              <w:rPr>
+                <w:rFonts w:ascii="Calibri" w:cs="Calibri" w:eastAsia="Calibri" w:hAnsi="Calibri"/>
+                <w:b w:val="false"/>
+                <w:bCs w:val="false"/>
+                <w:color w:val="22302A"/>
+                <w:sz w:val="20"/>
+                <w:szCs w:val="20"/>
+              </w:rPr>
+              <w:t xml:space="preserve">ENUM (sáng/chiều/nghỉ)</w:t>
+            </w:r>
+          </w:p>
+        </w:tc>
+        <w:tc>
+          <w:tcPr>
+            <w:tcW w:type="dxa" w:w="4114"/>
+            <w:tcMar>
+              <w:top w:type="dxa" w:w="100"/>
+              <w:left w:type="dxa" w:w="120"/>
+              <w:bottom w:type="dxa" w:w="100"/>
+              <w:right w:type="dxa" w:w="120"/>
+            </w:tcMar>
+            <w:vAlign w:val="center"/>
+          </w:tcPr>
+          <w:p>
+            <w:pPr>
+              <w:jc w:val="left"/>
+            </w:pPr>
+            <w:r>
+              <w:rPr>
+                <w:rFonts w:ascii="Calibri" w:cs="Calibri" w:eastAsia="Calibri" w:hAnsi="Calibri"/>
+                <w:b w:val="false"/>
+                <w:bCs w:val="false"/>
+                <w:color w:val="22302A"/>
+                <w:sz w:val="20"/>
+                <w:szCs w:val="20"/>
+              </w:rPr>
+              <w:t xml:space="preserve">Khớp đúng 3 trạng thái ca ở mục 9.5.</w:t>
+            </w:r>
+          </w:p>
+        </w:tc>
+      </w:tr>
+    </w:tbl>
+    <w:p>
+      <w:pPr>
+        <w:pStyle w:val="Heading3"/>
+        <w:spacing w:after="100" w:before="220"/>
+      </w:pPr>
+      <w:r>
+        <w:rPr>
+          <w:rFonts w:ascii="Calibri" w:cs="Calibri" w:eastAsia="Calibri" w:hAnsi="Calibri"/>
+          <w:b/>
+          <w:bCs/>
+          <w:color w:val="2FA968"/>
+        </w:rPr>
+        <w:t xml:space="preserve">news (field gốc, bổ sung field tender xem mục 15.9) / news_categories</w:t>
+      </w:r>
+    </w:p>
+    <w:tbl>
+      <w:tblPr>
+        <w:tblW w:type="dxa" w:w="9350"/>
+        <w:tblBorders>
+          <w:top w:val="single" w:color="auto" w:sz="4"/>
+          <w:left w:val="single" w:color="auto" w:sz="4"/>
+          <w:bottom w:val="single" w:color="auto" w:sz="4"/>
+          <w:right w:val="single" w:color="auto" w:sz="4"/>
+          <w:insideH w:val="single" w:color="auto" w:sz="4"/>
+          <w:insideV w:val="single" w:color="auto" w:sz="4"/>
+        </w:tblBorders>
+      </w:tblPr>
+      <w:tblGrid>
+        <w:gridCol w:w="2431"/>
+        <w:gridCol w:w="2805"/>
+        <w:gridCol w:w="4114"/>
+      </w:tblGrid>
+      <w:tr>
+        <w:trPr>
+          <w:tblHeader/>
+        </w:trPr>
+        <w:tc>
+          <w:tcPr>
+            <w:tcW w:type="dxa" w:w="2431"/>
+            <w:shd w:fill="164B36" w:val="clear"/>
+            <w:tcMar>
+              <w:top w:type="dxa" w:w="100"/>
+              <w:left w:type="dxa" w:w="120"/>
+              <w:bottom w:type="dxa" w:w="100"/>
+              <w:right w:type="dxa" w:w="120"/>
+            </w:tcMar>
+            <w:vAlign w:val="center"/>
+          </w:tcPr>
+          <w:p>
+            <w:pPr>
+              <w:jc w:val="left"/>
+            </w:pPr>
+            <w:r>
+              <w:rPr>
+                <w:rFonts w:ascii="Calibri" w:cs="Calibri" w:eastAsia="Calibri" w:hAnsi="Calibri"/>
+                <w:b/>
+                <w:bCs/>
+                <w:color w:val="FFFFFF"/>
+                <w:sz w:val="19"/>
+                <w:szCs w:val="19"/>
+              </w:rPr>
+              <w:t xml:space="preserve">Trường</w:t>
+            </w:r>
+          </w:p>
+        </w:tc>
+        <w:tc>
+          <w:tcPr>
+            <w:tcW w:type="dxa" w:w="2805"/>
+            <w:shd w:fill="164B36" w:val="clear"/>
+            <w:tcMar>
+              <w:top w:type="dxa" w:w="100"/>
+              <w:left w:type="dxa" w:w="120"/>
+              <w:bottom w:type="dxa" w:w="100"/>
+              <w:right w:type="dxa" w:w="120"/>
+            </w:tcMar>
+            <w:vAlign w:val="center"/>
+          </w:tcPr>
+          <w:p>
+            <w:pPr>
+              <w:jc w:val="left"/>
+            </w:pPr>
+            <w:r>
+              <w:rPr>
+                <w:rFonts w:ascii="Calibri" w:cs="Calibri" w:eastAsia="Calibri" w:hAnsi="Calibri"/>
+                <w:b/>
+                <w:bCs/>
+                <w:color w:val="FFFFFF"/>
+                <w:sz w:val="19"/>
+                <w:szCs w:val="19"/>
+              </w:rPr>
+              <w:t xml:space="preserve">Kiểu dữ liệu</w:t>
+            </w:r>
+          </w:p>
+        </w:tc>
+        <w:tc>
+          <w:tcPr>
+            <w:tcW w:type="dxa" w:w="4114"/>
+            <w:shd w:fill="164B36" w:val="clear"/>
+            <w:tcMar>
+              <w:top w:type="dxa" w:w="100"/>
+              <w:left w:type="dxa" w:w="120"/>
+              <w:bottom w:type="dxa" w:w="100"/>
+              <w:right w:type="dxa" w:w="120"/>
+            </w:tcMar>
+            <w:vAlign w:val="center"/>
+          </w:tcPr>
+          <w:p>
+            <w:pPr>
+              <w:jc w:val="left"/>
+            </w:pPr>
+            <w:r>
+              <w:rPr>
+                <w:rFonts w:ascii="Calibri" w:cs="Calibri" w:eastAsia="Calibri" w:hAnsi="Calibri"/>
+                <w:b/>
+                <w:bCs/>
+                <w:color w:val="FFFFFF"/>
+                <w:sz w:val="19"/>
+                <w:szCs w:val="19"/>
+              </w:rPr>
+              <w:t xml:space="preserve">Ghi chú</w:t>
+            </w:r>
+          </w:p>
+        </w:tc>
+      </w:tr>
+      <w:tr>
+        <w:tc>
+          <w:tcPr>
+            <w:tcW w:type="dxa" w:w="2431"/>
+            <w:tcMar>
+              <w:top w:type="dxa" w:w="100"/>
+              <w:left w:type="dxa" w:w="120"/>
+              <w:bottom w:type="dxa" w:w="100"/>
+              <w:right w:type="dxa" w:w="120"/>
+            </w:tcMar>
+            <w:vAlign w:val="center"/>
+          </w:tcPr>
+          <w:p>
+            <w:pPr>
+              <w:jc w:val="left"/>
+            </w:pPr>
+            <w:r>
+              <w:rPr>
+                <w:rFonts w:ascii="Calibri" w:cs="Calibri" w:eastAsia="Calibri" w:hAnsi="Calibri"/>
+                <w:b w:val="false"/>
+                <w:bCs w:val="false"/>
+                <w:color w:val="22302A"/>
+                <w:sz w:val="20"/>
+                <w:szCs w:val="20"/>
+              </w:rPr>
+              <w:t xml:space="preserve">id / category_id</w:t>
+            </w:r>
+          </w:p>
+        </w:tc>
+        <w:tc>
+          <w:tcPr>
+            <w:tcW w:type="dxa" w:w="2805"/>
+            <w:tcMar>
+              <w:top w:type="dxa" w:w="100"/>
+              <w:left w:type="dxa" w:w="120"/>
+              <w:bottom w:type="dxa" w:w="100"/>
+              <w:right w:type="dxa" w:w="120"/>
+            </w:tcMar>
+            <w:vAlign w:val="center"/>
+          </w:tcPr>
+          <w:p>
+            <w:pPr>
+              <w:jc w:val="left"/>
+            </w:pPr>
+            <w:r>
+              <w:rPr>
+                <w:rFonts w:ascii="Calibri" w:cs="Calibri" w:eastAsia="Calibri" w:hAnsi="Calibri"/>
+                <w:b w:val="false"/>
+                <w:bCs w:val="false"/>
+                <w:color w:val="22302A"/>
+                <w:sz w:val="20"/>
+                <w:szCs w:val="20"/>
+              </w:rPr>
+              <w:t xml:space="preserve">UUID (PK) / UUID (FK)</w:t>
+            </w:r>
+          </w:p>
+        </w:tc>
+        <w:tc>
+          <w:tcPr>
+            <w:tcW w:type="dxa" w:w="4114"/>
+            <w:tcMar>
+              <w:top w:type="dxa" w:w="100"/>
+              <w:left w:type="dxa" w:w="120"/>
+              <w:bottom w:type="dxa" w:w="100"/>
+              <w:right w:type="dxa" w:w="120"/>
+            </w:tcMar>
+            <w:vAlign w:val="center"/>
+          </w:tcPr>
+          <w:p>
+            <w:pPr>
+              <w:jc w:val="left"/>
+            </w:pPr>
+            <w:r>
+              <w:rPr>
+                <w:rFonts w:ascii="Calibri" w:cs="Calibri" w:eastAsia="Calibri" w:hAnsi="Calibri"/>
+                <w:b w:val="false"/>
+                <w:bCs w:val="false"/>
+                <w:color w:val="22302A"/>
+                <w:sz w:val="20"/>
+                <w:szCs w:val="20"/>
+              </w:rPr>
+              <w:t xml:space="preserve">category_id → news_categories.id (6 chuyên mục, mục 7.11).</w:t>
+            </w:r>
+          </w:p>
+        </w:tc>
+      </w:tr>
+      <w:tr>
+        <w:tc>
+          <w:tcPr>
+            <w:tcW w:type="dxa" w:w="2431"/>
+            <w:shd w:fill="F4F4F2" w:val="clear"/>
+            <w:tcMar>
+              <w:top w:type="dxa" w:w="100"/>
+              <w:left w:type="dxa" w:w="120"/>
+              <w:bottom w:type="dxa" w:w="100"/>
+              <w:right w:type="dxa" w:w="120"/>
+            </w:tcMar>
+            <w:vAlign w:val="center"/>
+          </w:tcPr>
+          <w:p>
+            <w:pPr>
+              <w:jc w:val="left"/>
+            </w:pPr>
+            <w:r>
+              <w:rPr>
+                <w:rFonts w:ascii="Calibri" w:cs="Calibri" w:eastAsia="Calibri" w:hAnsi="Calibri"/>
+                <w:b w:val="false"/>
+                <w:bCs w:val="false"/>
+                <w:color w:val="22302A"/>
+                <w:sz w:val="20"/>
+                <w:szCs w:val="20"/>
+              </w:rPr>
+              <w:t xml:space="preserve">title / slug / summary</w:t>
+            </w:r>
+          </w:p>
+        </w:tc>
+        <w:tc>
+          <w:tcPr>
+            <w:tcW w:type="dxa" w:w="2805"/>
+            <w:shd w:fill="F4F4F2" w:val="clear"/>
+            <w:tcMar>
+              <w:top w:type="dxa" w:w="100"/>
+              <w:left w:type="dxa" w:w="120"/>
+              <w:bottom w:type="dxa" w:w="100"/>
+              <w:right w:type="dxa" w:w="120"/>
+            </w:tcMar>
+            <w:vAlign w:val="center"/>
+          </w:tcPr>
+          <w:p>
+            <w:pPr>
+              <w:jc w:val="left"/>
+            </w:pPr>
+            <w:r>
+              <w:rPr>
+                <w:rFonts w:ascii="Calibri" w:cs="Calibri" w:eastAsia="Calibri" w:hAnsi="Calibri"/>
+                <w:b w:val="false"/>
+                <w:bCs w:val="false"/>
+                <w:color w:val="22302A"/>
+                <w:sz w:val="20"/>
+                <w:szCs w:val="20"/>
+              </w:rPr>
+              <w:t xml:space="preserve">VARCHAR / VARCHAR UNIQUE / VARCHAR(300)</w:t>
+            </w:r>
+          </w:p>
+        </w:tc>
+        <w:tc>
+          <w:tcPr>
+            <w:tcW w:type="dxa" w:w="4114"/>
+            <w:shd w:fill="F4F4F2" w:val="clear"/>
+            <w:tcMar>
+              <w:top w:type="dxa" w:w="100"/>
+              <w:left w:type="dxa" w:w="120"/>
+              <w:bottom w:type="dxa" w:w="100"/>
+              <w:right w:type="dxa" w:w="120"/>
+            </w:tcMar>
+            <w:vAlign w:val="center"/>
+          </w:tcPr>
+          <w:p>
+            <w:pPr>
+              <w:jc w:val="left"/>
+            </w:pPr>
+            <w:r>
+              <w:rPr>
+                <w:rFonts w:ascii="Calibri" w:cs="Calibri" w:eastAsia="Calibri" w:hAnsi="Calibri"/>
+                <w:b w:val="false"/>
+                <w:bCs w:val="false"/>
+                <w:color w:val="22302A"/>
+                <w:sz w:val="20"/>
+                <w:szCs w:val="20"/>
+              </w:rPr>
+              <w:t xml:space="preserve">Tiêu đề, đường dẫn, tóm tắt hiển thị thẻ.</w:t>
+            </w:r>
+          </w:p>
+        </w:tc>
+      </w:tr>
+      <w:tr>
+        <w:tc>
+          <w:tcPr>
+            <w:tcW w:type="dxa" w:w="2431"/>
+            <w:tcMar>
+              <w:top w:type="dxa" w:w="100"/>
+              <w:left w:type="dxa" w:w="120"/>
+              <w:bottom w:type="dxa" w:w="100"/>
+              <w:right w:type="dxa" w:w="120"/>
+            </w:tcMar>
+            <w:vAlign w:val="center"/>
+          </w:tcPr>
+          <w:p>
+            <w:pPr>
+              <w:jc w:val="left"/>
+            </w:pPr>
+            <w:r>
+              <w:rPr>
+                <w:rFonts w:ascii="Calibri" w:cs="Calibri" w:eastAsia="Calibri" w:hAnsi="Calibri"/>
+                <w:b w:val="false"/>
+                <w:bCs w:val="false"/>
+                <w:color w:val="22302A"/>
+                <w:sz w:val="20"/>
+                <w:szCs w:val="20"/>
+              </w:rPr>
+              <w:t xml:space="preserve">content</w:t>
+            </w:r>
+          </w:p>
+        </w:tc>
+        <w:tc>
+          <w:tcPr>
+            <w:tcW w:type="dxa" w:w="2805"/>
+            <w:tcMar>
+              <w:top w:type="dxa" w:w="100"/>
+              <w:left w:type="dxa" w:w="120"/>
+              <w:bottom w:type="dxa" w:w="100"/>
+              <w:right w:type="dxa" w:w="120"/>
+            </w:tcMar>
+            <w:vAlign w:val="center"/>
+          </w:tcPr>
+          <w:p>
+            <w:pPr>
+              <w:jc w:val="left"/>
+            </w:pPr>
+            <w:r>
+              <w:rPr>
+                <w:rFonts w:ascii="Calibri" w:cs="Calibri" w:eastAsia="Calibri" w:hAnsi="Calibri"/>
+                <w:b w:val="false"/>
+                <w:bCs w:val="false"/>
+                <w:color w:val="22302A"/>
+                <w:sz w:val="20"/>
+                <w:szCs w:val="20"/>
+              </w:rPr>
+              <w:t xml:space="preserve">TEXT (HTML/Markdown)</w:t>
+            </w:r>
+          </w:p>
+        </w:tc>
+        <w:tc>
+          <w:tcPr>
+            <w:tcW w:type="dxa" w:w="4114"/>
+            <w:tcMar>
+              <w:top w:type="dxa" w:w="100"/>
+              <w:left w:type="dxa" w:w="120"/>
+              <w:bottom w:type="dxa" w:w="100"/>
+              <w:right w:type="dxa" w:w="120"/>
+            </w:tcMar>
+            <w:vAlign w:val="center"/>
+          </w:tcPr>
+          <w:p>
+            <w:pPr>
+              <w:jc w:val="left"/>
+            </w:pPr>
+            <w:r>
+              <w:rPr>
+                <w:rFonts w:ascii="Calibri" w:cs="Calibri" w:eastAsia="Calibri" w:hAnsi="Calibri"/>
+                <w:b w:val="false"/>
+                <w:bCs w:val="false"/>
+                <w:color w:val="22302A"/>
+                <w:sz w:val="20"/>
+                <w:szCs w:val="20"/>
+              </w:rPr>
+              <w:t xml:space="preserve">Nội dung chi tiết — Template C4 mục 8.3.</w:t>
+            </w:r>
+          </w:p>
+        </w:tc>
+      </w:tr>
+      <w:tr>
+        <w:tc>
+          <w:tcPr>
+            <w:tcW w:type="dxa" w:w="2431"/>
+            <w:shd w:fill="F4F4F2" w:val="clear"/>
+            <w:tcMar>
+              <w:top w:type="dxa" w:w="100"/>
+              <w:left w:type="dxa" w:w="120"/>
+              <w:bottom w:type="dxa" w:w="100"/>
+              <w:right w:type="dxa" w:w="120"/>
+            </w:tcMar>
+            <w:vAlign w:val="center"/>
+          </w:tcPr>
+          <w:p>
+            <w:pPr>
+              <w:jc w:val="left"/>
+            </w:pPr>
+            <w:r>
+              <w:rPr>
+                <w:rFonts w:ascii="Calibri" w:cs="Calibri" w:eastAsia="Calibri" w:hAnsi="Calibri"/>
+                <w:b w:val="false"/>
+                <w:bCs w:val="false"/>
+                <w:color w:val="22302A"/>
+                <w:sz w:val="20"/>
+                <w:szCs w:val="20"/>
+              </w:rPr>
+              <w:t xml:space="preserve">cover_image</w:t>
+            </w:r>
+          </w:p>
+        </w:tc>
+        <w:tc>
+          <w:tcPr>
+            <w:tcW w:type="dxa" w:w="2805"/>
+            <w:shd w:fill="F4F4F2" w:val="clear"/>
+            <w:tcMar>
+              <w:top w:type="dxa" w:w="100"/>
+              <w:left w:type="dxa" w:w="120"/>
+              <w:bottom w:type="dxa" w:w="100"/>
+              <w:right w:type="dxa" w:w="120"/>
+            </w:tcMar>
+            <w:vAlign w:val="center"/>
+          </w:tcPr>
+          <w:p>
+            <w:pPr>
+              <w:jc w:val="left"/>
+            </w:pPr>
+            <w:r>
+              <w:rPr>
+                <w:rFonts w:ascii="Calibri" w:cs="Calibri" w:eastAsia="Calibri" w:hAnsi="Calibri"/>
+                <w:b w:val="false"/>
+                <w:bCs w:val="false"/>
+                <w:color w:val="22302A"/>
+                <w:sz w:val="20"/>
+                <w:szCs w:val="20"/>
+              </w:rPr>
+              <w:t xml:space="preserve">VARCHAR(255)</w:t>
+            </w:r>
+          </w:p>
+        </w:tc>
+        <w:tc>
+          <w:tcPr>
+            <w:tcW w:type="dxa" w:w="4114"/>
+            <w:shd w:fill="F4F4F2" w:val="clear"/>
+            <w:tcMar>
+              <w:top w:type="dxa" w:w="100"/>
+              <w:left w:type="dxa" w:w="120"/>
+              <w:bottom w:type="dxa" w:w="100"/>
+              <w:right w:type="dxa" w:w="120"/>
+            </w:tcMar>
+            <w:vAlign w:val="center"/>
+          </w:tcPr>
+          <w:p>
+            <w:pPr>
+              <w:jc w:val="left"/>
+            </w:pPr>
+            <w:r>
+              <w:rPr>
+                <w:rFonts w:ascii="Calibri" w:cs="Calibri" w:eastAsia="Calibri" w:hAnsi="Calibri"/>
+                <w:b w:val="false"/>
+                <w:bCs w:val="false"/>
+                <w:color w:val="22302A"/>
+                <w:sz w:val="20"/>
+                <w:szCs w:val="20"/>
+              </w:rPr>
+              <w:t xml:space="preserve">Ảnh đại diện tỉ lệ 16:10 (mục 7.11).</w:t>
+            </w:r>
+          </w:p>
+        </w:tc>
+      </w:tr>
+      <w:tr>
+        <w:tc>
+          <w:tcPr>
+            <w:tcW w:type="dxa" w:w="2431"/>
+            <w:tcMar>
+              <w:top w:type="dxa" w:w="100"/>
+              <w:left w:type="dxa" w:w="120"/>
+              <w:bottom w:type="dxa" w:w="100"/>
+              <w:right w:type="dxa" w:w="120"/>
+            </w:tcMar>
+            <w:vAlign w:val="center"/>
+          </w:tcPr>
+          <w:p>
+            <w:pPr>
+              <w:jc w:val="left"/>
+            </w:pPr>
+            <w:r>
+              <w:rPr>
+                <w:rFonts w:ascii="Calibri" w:cs="Calibri" w:eastAsia="Calibri" w:hAnsi="Calibri"/>
+                <w:b w:val="false"/>
+                <w:bCs w:val="false"/>
+                <w:color w:val="22302A"/>
+                <w:sz w:val="20"/>
+                <w:szCs w:val="20"/>
+              </w:rPr>
+              <w:t xml:space="preserve">tag</w:t>
+            </w:r>
+          </w:p>
+        </w:tc>
+        <w:tc>
+          <w:tcPr>
+            <w:tcW w:type="dxa" w:w="2805"/>
+            <w:tcMar>
+              <w:top w:type="dxa" w:w="100"/>
+              <w:left w:type="dxa" w:w="120"/>
+              <w:bottom w:type="dxa" w:w="100"/>
+              <w:right w:type="dxa" w:w="120"/>
+            </w:tcMar>
+            <w:vAlign w:val="center"/>
+          </w:tcPr>
+          <w:p>
+            <w:pPr>
+              <w:jc w:val="left"/>
+            </w:pPr>
+            <w:r>
+              <w:rPr>
+                <w:rFonts w:ascii="Calibri" w:cs="Calibri" w:eastAsia="Calibri" w:hAnsi="Calibri"/>
+                <w:b w:val="false"/>
+                <w:bCs w:val="false"/>
+                <w:color w:val="22302A"/>
+                <w:sz w:val="20"/>
+                <w:szCs w:val="20"/>
+              </w:rPr>
+              <w:t xml:space="preserve">ENUM</w:t>
+            </w:r>
+          </w:p>
+        </w:tc>
+        <w:tc>
+          <w:tcPr>
+            <w:tcW w:type="dxa" w:w="4114"/>
+            <w:tcMar>
+              <w:top w:type="dxa" w:w="100"/>
+              <w:left w:type="dxa" w:w="120"/>
+              <w:bottom w:type="dxa" w:w="100"/>
+              <w:right w:type="dxa" w:w="120"/>
+            </w:tcMar>
+            <w:vAlign w:val="center"/>
+          </w:tcPr>
+          <w:p>
+            <w:pPr>
+              <w:jc w:val="left"/>
+            </w:pPr>
+            <w:r>
+              <w:rPr>
+                <w:rFonts w:ascii="Calibri" w:cs="Calibri" w:eastAsia="Calibri" w:hAnsi="Calibri"/>
+                <w:b w:val="false"/>
+                <w:bCs w:val="false"/>
+                <w:color w:val="22302A"/>
+                <w:sz w:val="20"/>
+                <w:szCs w:val="20"/>
+              </w:rPr>
+              <w:t xml:space="preserve">Tin y học / Thông báo / Sự kiện / Tuyển dụng — is_tender=true luôn kèm tag Thông báo (mục 18.4).</w:t>
+            </w:r>
+          </w:p>
+        </w:tc>
+      </w:tr>
+      <w:tr>
+        <w:tc>
+          <w:tcPr>
+            <w:tcW w:type="dxa" w:w="2431"/>
+            <w:shd w:fill="F4F4F2" w:val="clear"/>
+            <w:tcMar>
+              <w:top w:type="dxa" w:w="100"/>
+              <w:left w:type="dxa" w:w="120"/>
+              <w:bottom w:type="dxa" w:w="100"/>
+              <w:right w:type="dxa" w:w="120"/>
+            </w:tcMar>
+            <w:vAlign w:val="center"/>
+          </w:tcPr>
+          <w:p>
+            <w:pPr>
+              <w:jc w:val="left"/>
+            </w:pPr>
+            <w:r>
+              <w:rPr>
+                <w:rFonts w:ascii="Calibri" w:cs="Calibri" w:eastAsia="Calibri" w:hAnsi="Calibri"/>
+                <w:b w:val="false"/>
+                <w:bCs w:val="false"/>
+                <w:color w:val="22302A"/>
+                <w:sz w:val="20"/>
+                <w:szCs w:val="20"/>
+              </w:rPr>
+              <w:t xml:space="preserve">author_id</w:t>
+            </w:r>
+          </w:p>
+        </w:tc>
+        <w:tc>
+          <w:tcPr>
+            <w:tcW w:type="dxa" w:w="2805"/>
+            <w:shd w:fill="F4F4F2" w:val="clear"/>
+            <w:tcMar>
+              <w:top w:type="dxa" w:w="100"/>
+              <w:left w:type="dxa" w:w="120"/>
+              <w:bottom w:type="dxa" w:w="100"/>
+              <w:right w:type="dxa" w:w="120"/>
+            </w:tcMar>
+            <w:vAlign w:val="center"/>
+          </w:tcPr>
+          <w:p>
+            <w:pPr>
+              <w:jc w:val="left"/>
+            </w:pPr>
+            <w:r>
+              <w:rPr>
+                <w:rFonts w:ascii="Calibri" w:cs="Calibri" w:eastAsia="Calibri" w:hAnsi="Calibri"/>
+                <w:b w:val="false"/>
+                <w:bCs w:val="false"/>
+                <w:color w:val="22302A"/>
+                <w:sz w:val="20"/>
+                <w:szCs w:val="20"/>
+              </w:rPr>
+              <w:t xml:space="preserve">UUID (FK → doctors.id, nullable)</w:t>
+            </w:r>
+          </w:p>
+        </w:tc>
+        <w:tc>
+          <w:tcPr>
+            <w:tcW w:type="dxa" w:w="4114"/>
+            <w:shd w:fill="F4F4F2" w:val="clear"/>
+            <w:tcMar>
+              <w:top w:type="dxa" w:w="100"/>
+              <w:left w:type="dxa" w:w="120"/>
+              <w:bottom w:type="dxa" w:w="100"/>
+              <w:right w:type="dxa" w:w="120"/>
+            </w:tcMar>
+            <w:vAlign w:val="center"/>
+          </w:tcPr>
+          <w:p>
+            <w:pPr>
+              <w:jc w:val="left"/>
+            </w:pPr>
+            <w:r>
+              <w:rPr>
+                <w:rFonts w:ascii="Calibri" w:cs="Calibri" w:eastAsia="Calibri" w:hAnsi="Calibri"/>
+                <w:b w:val="false"/>
+                <w:bCs w:val="false"/>
+                <w:color w:val="22302A"/>
+                <w:sz w:val="20"/>
+                <w:szCs w:val="20"/>
+              </w:rPr>
+              <w:t xml:space="preserve">Bài do bác sĩ tư vấn đứng tên (tuỳ chọn).</w:t>
+            </w:r>
+          </w:p>
+        </w:tc>
+      </w:tr>
+      <w:tr>
+        <w:tc>
+          <w:tcPr>
+            <w:tcW w:type="dxa" w:w="2431"/>
+            <w:tcMar>
+              <w:top w:type="dxa" w:w="100"/>
+              <w:left w:type="dxa" w:w="120"/>
+              <w:bottom w:type="dxa" w:w="100"/>
+              <w:right w:type="dxa" w:w="120"/>
+            </w:tcMar>
+            <w:vAlign w:val="center"/>
+          </w:tcPr>
+          <w:p>
+            <w:pPr>
+              <w:jc w:val="left"/>
+            </w:pPr>
+            <w:r>
+              <w:rPr>
+                <w:rFonts w:ascii="Calibri" w:cs="Calibri" w:eastAsia="Calibri" w:hAnsi="Calibri"/>
+                <w:b w:val="false"/>
+                <w:bCs w:val="false"/>
+                <w:color w:val="22302A"/>
+                <w:sz w:val="20"/>
+                <w:szCs w:val="20"/>
+              </w:rPr>
+              <w:t xml:space="preserve">is_published / published_at</w:t>
+            </w:r>
+          </w:p>
+        </w:tc>
+        <w:tc>
+          <w:tcPr>
+            <w:tcW w:type="dxa" w:w="2805"/>
+            <w:tcMar>
+              <w:top w:type="dxa" w:w="100"/>
+              <w:left w:type="dxa" w:w="120"/>
+              <w:bottom w:type="dxa" w:w="100"/>
+              <w:right w:type="dxa" w:w="120"/>
+            </w:tcMar>
+            <w:vAlign w:val="center"/>
+          </w:tcPr>
+          <w:p>
+            <w:pPr>
+              <w:jc w:val="left"/>
+            </w:pPr>
+            <w:r>
+              <w:rPr>
+                <w:rFonts w:ascii="Calibri" w:cs="Calibri" w:eastAsia="Calibri" w:hAnsi="Calibri"/>
+                <w:b w:val="false"/>
+                <w:bCs w:val="false"/>
+                <w:color w:val="22302A"/>
+                <w:sz w:val="20"/>
+                <w:szCs w:val="20"/>
+              </w:rPr>
+              <w:t xml:space="preserve">BOOLEAN / TIMESTAMP</w:t>
+            </w:r>
+          </w:p>
+        </w:tc>
+        <w:tc>
+          <w:tcPr>
+            <w:tcW w:type="dxa" w:w="4114"/>
+            <w:tcMar>
+              <w:top w:type="dxa" w:w="100"/>
+              <w:left w:type="dxa" w:w="120"/>
+              <w:bottom w:type="dxa" w:w="100"/>
+              <w:right w:type="dxa" w:w="120"/>
+            </w:tcMar>
+            <w:vAlign w:val="center"/>
+          </w:tcPr>
+          <w:p>
+            <w:pPr>
+              <w:jc w:val="left"/>
+            </w:pPr>
+            <w:r>
+              <w:rPr>
+                <w:rFonts w:ascii="Calibri" w:cs="Calibri" w:eastAsia="Calibri" w:hAnsi="Calibri"/>
+                <w:b w:val="false"/>
+                <w:bCs w:val="false"/>
+                <w:color w:val="22302A"/>
+                <w:sz w:val="20"/>
+                <w:szCs w:val="20"/>
+              </w:rPr>
+              <w:t xml:space="preserve">Cho phép soạn nháp trước khi công khai.</w:t>
+            </w:r>
+          </w:p>
+        </w:tc>
+      </w:tr>
+    </w:tbl>
+    <w:p>
+      <w:pPr>
+        <w:pStyle w:val="Heading3"/>
+        <w:spacing w:after="100" w:before="220"/>
+      </w:pPr>
+      <w:r>
+        <w:rPr>
+          <w:rFonts w:ascii="Calibri" w:cs="Calibri" w:eastAsia="Calibri" w:hAnsi="Calibri"/>
+          <w:b/>
+          <w:bCs/>
+          <w:color w:val="2FA968"/>
+        </w:rPr>
+        <w:t xml:space="preserve">testimonials (bổ sung cờ duyệt — khắc phục lỗ hổng kiểm duyệt)</w:t>
+      </w:r>
+    </w:p>
+    <w:tbl>
+      <w:tblPr>
+        <w:tblW w:type="dxa" w:w="9350"/>
+        <w:tblBorders>
+          <w:top w:val="single" w:color="auto" w:sz="4"/>
+          <w:left w:val="single" w:color="auto" w:sz="4"/>
+          <w:bottom w:val="single" w:color="auto" w:sz="4"/>
+          <w:right w:val="single" w:color="auto" w:sz="4"/>
+          <w:insideH w:val="single" w:color="auto" w:sz="4"/>
+          <w:insideV w:val="single" w:color="auto" w:sz="4"/>
+        </w:tblBorders>
+      </w:tblPr>
+      <w:tblGrid>
+        <w:gridCol w:w="2057"/>
+        <w:gridCol w:w="2805"/>
+        <w:gridCol w:w="4488"/>
+      </w:tblGrid>
+      <w:tr>
+        <w:trPr>
+          <w:tblHeader/>
+        </w:trPr>
+        <w:tc>
+          <w:tcPr>
+            <w:tcW w:type="dxa" w:w="2057"/>
+            <w:shd w:fill="164B36" w:val="clear"/>
+            <w:tcMar>
+              <w:top w:type="dxa" w:w="100"/>
+              <w:left w:type="dxa" w:w="120"/>
+              <w:bottom w:type="dxa" w:w="100"/>
+              <w:right w:type="dxa" w:w="120"/>
+            </w:tcMar>
+            <w:vAlign w:val="center"/>
+          </w:tcPr>
+          <w:p>
+            <w:pPr>
+              <w:jc w:val="left"/>
+            </w:pPr>
+            <w:r>
+              <w:rPr>
+                <w:rFonts w:ascii="Calibri" w:cs="Calibri" w:eastAsia="Calibri" w:hAnsi="Calibri"/>
+                <w:b/>
+                <w:bCs/>
+                <w:color w:val="FFFFFF"/>
+                <w:sz w:val="19"/>
+                <w:szCs w:val="19"/>
+              </w:rPr>
+              <w:t xml:space="preserve">Trường</w:t>
+            </w:r>
+          </w:p>
+        </w:tc>
+        <w:tc>
+          <w:tcPr>
+            <w:tcW w:type="dxa" w:w="2805"/>
+            <w:shd w:fill="164B36" w:val="clear"/>
+            <w:tcMar>
+              <w:top w:type="dxa" w:w="100"/>
+              <w:left w:type="dxa" w:w="120"/>
+              <w:bottom w:type="dxa" w:w="100"/>
+              <w:right w:type="dxa" w:w="120"/>
+            </w:tcMar>
+            <w:vAlign w:val="center"/>
+          </w:tcPr>
+          <w:p>
+            <w:pPr>
+              <w:jc w:val="left"/>
+            </w:pPr>
+            <w:r>
+              <w:rPr>
+                <w:rFonts w:ascii="Calibri" w:cs="Calibri" w:eastAsia="Calibri" w:hAnsi="Calibri"/>
+                <w:b/>
+                <w:bCs/>
+                <w:color w:val="FFFFFF"/>
+                <w:sz w:val="19"/>
+                <w:szCs w:val="19"/>
+              </w:rPr>
+              <w:t xml:space="preserve">Kiểu dữ liệu</w:t>
+            </w:r>
+          </w:p>
+        </w:tc>
+        <w:tc>
+          <w:tcPr>
+            <w:tcW w:type="dxa" w:w="4488"/>
+            <w:shd w:fill="164B36" w:val="clear"/>
+            <w:tcMar>
+              <w:top w:type="dxa" w:w="100"/>
+              <w:left w:type="dxa" w:w="120"/>
+              <w:bottom w:type="dxa" w:w="100"/>
+              <w:right w:type="dxa" w:w="120"/>
+            </w:tcMar>
+            <w:vAlign w:val="center"/>
+          </w:tcPr>
+          <w:p>
+            <w:pPr>
+              <w:jc w:val="left"/>
+            </w:pPr>
+            <w:r>
+              <w:rPr>
+                <w:rFonts w:ascii="Calibri" w:cs="Calibri" w:eastAsia="Calibri" w:hAnsi="Calibri"/>
+                <w:b/>
+                <w:bCs/>
+                <w:color w:val="FFFFFF"/>
+                <w:sz w:val="19"/>
+                <w:szCs w:val="19"/>
+              </w:rPr>
+              <w:t xml:space="preserve">Ghi chú</w:t>
+            </w:r>
+          </w:p>
+        </w:tc>
+      </w:tr>
+      <w:tr>
+        <w:tc>
+          <w:tcPr>
+            <w:tcW w:type="dxa" w:w="2057"/>
+            <w:tcMar>
+              <w:top w:type="dxa" w:w="100"/>
+              <w:left w:type="dxa" w:w="120"/>
+              <w:bottom w:type="dxa" w:w="100"/>
+              <w:right w:type="dxa" w:w="120"/>
+            </w:tcMar>
+            <w:vAlign w:val="center"/>
+          </w:tcPr>
+          <w:p>
+            <w:pPr>
+              <w:jc w:val="left"/>
+            </w:pPr>
+            <w:r>
+              <w:rPr>
+                <w:rFonts w:ascii="Calibri" w:cs="Calibri" w:eastAsia="Calibri" w:hAnsi="Calibri"/>
+                <w:b w:val="false"/>
+                <w:bCs w:val="false"/>
+                <w:color w:val="22302A"/>
+                <w:sz w:val="20"/>
+                <w:szCs w:val="20"/>
+              </w:rPr>
+              <w:t xml:space="preserve">id</w:t>
+            </w:r>
+          </w:p>
+        </w:tc>
+        <w:tc>
+          <w:tcPr>
+            <w:tcW w:type="dxa" w:w="2805"/>
+            <w:tcMar>
+              <w:top w:type="dxa" w:w="100"/>
+              <w:left w:type="dxa" w:w="120"/>
+              <w:bottom w:type="dxa" w:w="100"/>
+              <w:right w:type="dxa" w:w="120"/>
+            </w:tcMar>
+            <w:vAlign w:val="center"/>
+          </w:tcPr>
+          <w:p>
+            <w:pPr>
+              <w:jc w:val="left"/>
+            </w:pPr>
+            <w:r>
+              <w:rPr>
+                <w:rFonts w:ascii="Calibri" w:cs="Calibri" w:eastAsia="Calibri" w:hAnsi="Calibri"/>
+                <w:b w:val="false"/>
+                <w:bCs w:val="false"/>
+                <w:color w:val="22302A"/>
+                <w:sz w:val="20"/>
+                <w:szCs w:val="20"/>
+              </w:rPr>
+              <w:t xml:space="preserve">UUID (PK)</w:t>
+            </w:r>
+          </w:p>
+        </w:tc>
+        <w:tc>
+          <w:tcPr>
+            <w:tcW w:type="dxa" w:w="4488"/>
+            <w:tcMar>
+              <w:top w:type="dxa" w:w="100"/>
+              <w:left w:type="dxa" w:w="120"/>
+              <w:bottom w:type="dxa" w:w="100"/>
+              <w:right w:type="dxa" w:w="120"/>
+            </w:tcMar>
+            <w:vAlign w:val="center"/>
+          </w:tcPr>
+          <w:p>
+            <w:pPr>
+              <w:jc w:val="left"/>
+            </w:pPr>
+            <w:r>
+              <w:rPr>
+                <w:rFonts w:ascii="Calibri" w:cs="Calibri" w:eastAsia="Calibri" w:hAnsi="Calibri"/>
+                <w:b w:val="false"/>
+                <w:bCs w:val="false"/>
+                <w:color w:val="22302A"/>
+                <w:sz w:val="20"/>
+                <w:szCs w:val="20"/>
+              </w:rPr>
+              <w:t xml:space="preserve">Khoá chính.</w:t>
+            </w:r>
+          </w:p>
+        </w:tc>
+      </w:tr>
+      <w:tr>
+        <w:tc>
+          <w:tcPr>
+            <w:tcW w:type="dxa" w:w="2057"/>
+            <w:shd w:fill="F4F4F2" w:val="clear"/>
+            <w:tcMar>
+              <w:top w:type="dxa" w:w="100"/>
+              <w:left w:type="dxa" w:w="120"/>
+              <w:bottom w:type="dxa" w:w="100"/>
+              <w:right w:type="dxa" w:w="120"/>
+            </w:tcMar>
+            <w:vAlign w:val="center"/>
+          </w:tcPr>
+          <w:p>
+            <w:pPr>
+              <w:jc w:val="left"/>
+            </w:pPr>
+            <w:r>
+              <w:rPr>
+                <w:rFonts w:ascii="Calibri" w:cs="Calibri" w:eastAsia="Calibri" w:hAnsi="Calibri"/>
+                <w:b w:val="false"/>
+                <w:bCs w:val="false"/>
+                <w:color w:val="22302A"/>
+                <w:sz w:val="20"/>
+                <w:szCs w:val="20"/>
+              </w:rPr>
+              <w:t xml:space="preserve">patient_name / avatar_url</w:t>
+            </w:r>
+          </w:p>
+        </w:tc>
+        <w:tc>
+          <w:tcPr>
+            <w:tcW w:type="dxa" w:w="2805"/>
+            <w:shd w:fill="F4F4F2" w:val="clear"/>
+            <w:tcMar>
+              <w:top w:type="dxa" w:w="100"/>
+              <w:left w:type="dxa" w:w="120"/>
+              <w:bottom w:type="dxa" w:w="100"/>
+              <w:right w:type="dxa" w:w="120"/>
+            </w:tcMar>
+            <w:vAlign w:val="center"/>
+          </w:tcPr>
+          <w:p>
+            <w:pPr>
+              <w:jc w:val="left"/>
+            </w:pPr>
+            <w:r>
+              <w:rPr>
+                <w:rFonts w:ascii="Calibri" w:cs="Calibri" w:eastAsia="Calibri" w:hAnsi="Calibri"/>
+                <w:b w:val="false"/>
+                <w:bCs w:val="false"/>
+                <w:color w:val="22302A"/>
+                <w:sz w:val="20"/>
+                <w:szCs w:val="20"/>
+              </w:rPr>
+              <w:t xml:space="preserve">VARCHAR(150) / VARCHAR(255)</w:t>
+            </w:r>
+          </w:p>
+        </w:tc>
+        <w:tc>
+          <w:tcPr>
+            <w:tcW w:type="dxa" w:w="4488"/>
+            <w:shd w:fill="F4F4F2" w:val="clear"/>
+            <w:tcMar>
+              <w:top w:type="dxa" w:w="100"/>
+              <w:left w:type="dxa" w:w="120"/>
+              <w:bottom w:type="dxa" w:w="100"/>
+              <w:right w:type="dxa" w:w="120"/>
+            </w:tcMar>
+            <w:vAlign w:val="center"/>
+          </w:tcPr>
+          <w:p>
+            <w:pPr>
+              <w:jc w:val="left"/>
+            </w:pPr>
+            <w:r>
+              <w:rPr>
+                <w:rFonts w:ascii="Calibri" w:cs="Calibri" w:eastAsia="Calibri" w:hAnsi="Calibri"/>
+                <w:b w:val="false"/>
+                <w:bCs w:val="false"/>
+                <w:color w:val="22302A"/>
+                <w:sz w:val="20"/>
+                <w:szCs w:val="20"/>
+              </w:rPr>
+              <w:t xml:space="preserve">Tên hiển thị, ảnh đại diện (mục 7.10).</w:t>
+            </w:r>
+          </w:p>
+        </w:tc>
+      </w:tr>
+      <w:tr>
+        <w:tc>
+          <w:tcPr>
+            <w:tcW w:type="dxa" w:w="2057"/>
+            <w:tcMar>
+              <w:top w:type="dxa" w:w="100"/>
+              <w:left w:type="dxa" w:w="120"/>
+              <w:bottom w:type="dxa" w:w="100"/>
+              <w:right w:type="dxa" w:w="120"/>
+            </w:tcMar>
+            <w:vAlign w:val="center"/>
+          </w:tcPr>
+          <w:p>
+            <w:pPr>
+              <w:jc w:val="left"/>
+            </w:pPr>
+            <w:r>
+              <w:rPr>
+                <w:rFonts w:ascii="Calibri" w:cs="Calibri" w:eastAsia="Calibri" w:hAnsi="Calibri"/>
+                <w:b w:val="false"/>
+                <w:bCs w:val="false"/>
+                <w:color w:val="22302A"/>
+                <w:sz w:val="20"/>
+                <w:szCs w:val="20"/>
+              </w:rPr>
+              <w:t xml:space="preserve">content</w:t>
+            </w:r>
+          </w:p>
+        </w:tc>
+        <w:tc>
+          <w:tcPr>
+            <w:tcW w:type="dxa" w:w="2805"/>
+            <w:tcMar>
+              <w:top w:type="dxa" w:w="100"/>
+              <w:left w:type="dxa" w:w="120"/>
+              <w:bottom w:type="dxa" w:w="100"/>
+              <w:right w:type="dxa" w:w="120"/>
+            </w:tcMar>
+            <w:vAlign w:val="center"/>
+          </w:tcPr>
+          <w:p>
+            <w:pPr>
+              <w:jc w:val="left"/>
+            </w:pPr>
+            <w:r>
+              <w:rPr>
+                <w:rFonts w:ascii="Calibri" w:cs="Calibri" w:eastAsia="Calibri" w:hAnsi="Calibri"/>
+                <w:b w:val="false"/>
+                <w:bCs w:val="false"/>
+                <w:color w:val="22302A"/>
+                <w:sz w:val="20"/>
+                <w:szCs w:val="20"/>
+              </w:rPr>
+              <w:t xml:space="preserve">TEXT</w:t>
+            </w:r>
+          </w:p>
+        </w:tc>
+        <w:tc>
+          <w:tcPr>
+            <w:tcW w:type="dxa" w:w="4488"/>
+            <w:tcMar>
+              <w:top w:type="dxa" w:w="100"/>
+              <w:left w:type="dxa" w:w="120"/>
+              <w:bottom w:type="dxa" w:w="100"/>
+              <w:right w:type="dxa" w:w="120"/>
+            </w:tcMar>
+            <w:vAlign w:val="center"/>
+          </w:tcPr>
+          <w:p>
+            <w:pPr>
+              <w:jc w:val="left"/>
+            </w:pPr>
+            <w:r>
+              <w:rPr>
+                <w:rFonts w:ascii="Calibri" w:cs="Calibri" w:eastAsia="Calibri" w:hAnsi="Calibri"/>
+                <w:b w:val="false"/>
+                <w:bCs w:val="false"/>
+                <w:color w:val="22302A"/>
+                <w:sz w:val="20"/>
+                <w:szCs w:val="20"/>
+              </w:rPr>
+              <w:t xml:space="preserve">Nội dung đánh giá.</w:t>
+            </w:r>
+          </w:p>
+        </w:tc>
+      </w:tr>
+      <w:tr>
+        <w:tc>
+          <w:tcPr>
+            <w:tcW w:type="dxa" w:w="2057"/>
+            <w:shd w:fill="F4F4F2" w:val="clear"/>
+            <w:tcMar>
+              <w:top w:type="dxa" w:w="100"/>
+              <w:left w:type="dxa" w:w="120"/>
+              <w:bottom w:type="dxa" w:w="100"/>
+              <w:right w:type="dxa" w:w="120"/>
+            </w:tcMar>
+            <w:vAlign w:val="center"/>
+          </w:tcPr>
+          <w:p>
+            <w:pPr>
+              <w:jc w:val="left"/>
+            </w:pPr>
+            <w:r>
+              <w:rPr>
+                <w:rFonts w:ascii="Calibri" w:cs="Calibri" w:eastAsia="Calibri" w:hAnsi="Calibri"/>
+                <w:b w:val="false"/>
+                <w:bCs w:val="false"/>
+                <w:color w:val="22302A"/>
+                <w:sz w:val="20"/>
+                <w:szCs w:val="20"/>
+              </w:rPr>
+              <w:t xml:space="preserve">rating</w:t>
+            </w:r>
+          </w:p>
+        </w:tc>
+        <w:tc>
+          <w:tcPr>
+            <w:tcW w:type="dxa" w:w="2805"/>
+            <w:shd w:fill="F4F4F2" w:val="clear"/>
+            <w:tcMar>
+              <w:top w:type="dxa" w:w="100"/>
+              <w:left w:type="dxa" w:w="120"/>
+              <w:bottom w:type="dxa" w:w="100"/>
+              <w:right w:type="dxa" w:w="120"/>
+            </w:tcMar>
+            <w:vAlign w:val="center"/>
+          </w:tcPr>
+          <w:p>
+            <w:pPr>
+              <w:jc w:val="left"/>
+            </w:pPr>
+            <w:r>
+              <w:rPr>
+                <w:rFonts w:ascii="Calibri" w:cs="Calibri" w:eastAsia="Calibri" w:hAnsi="Calibri"/>
+                <w:b w:val="false"/>
+                <w:bCs w:val="false"/>
+                <w:color w:val="22302A"/>
+                <w:sz w:val="20"/>
+                <w:szCs w:val="20"/>
+              </w:rPr>
+              <w:t xml:space="preserve">SMALLINT (1–5)</w:t>
+            </w:r>
+          </w:p>
+        </w:tc>
+        <w:tc>
+          <w:tcPr>
+            <w:tcW w:type="dxa" w:w="4488"/>
+            <w:shd w:fill="F4F4F2" w:val="clear"/>
+            <w:tcMar>
+              <w:top w:type="dxa" w:w="100"/>
+              <w:left w:type="dxa" w:w="120"/>
+              <w:bottom w:type="dxa" w:w="100"/>
+              <w:right w:type="dxa" w:w="120"/>
+            </w:tcMar>
+            <w:vAlign w:val="center"/>
+          </w:tcPr>
+          <w:p>
+            <w:pPr>
+              <w:jc w:val="left"/>
+            </w:pPr>
+            <w:r>
+              <w:rPr>
+                <w:rFonts w:ascii="Calibri" w:cs="Calibri" w:eastAsia="Calibri" w:hAnsi="Calibri"/>
+                <w:b w:val="false"/>
+                <w:bCs w:val="false"/>
+                <w:color w:val="22302A"/>
+                <w:sz w:val="20"/>
+                <w:szCs w:val="20"/>
+              </w:rPr>
+              <w:t xml:space="preserve">Số sao đánh giá.</w:t>
+            </w:r>
+          </w:p>
+        </w:tc>
+      </w:tr>
+      <w:tr>
+        <w:tc>
+          <w:tcPr>
+            <w:tcW w:type="dxa" w:w="2057"/>
+            <w:tcMar>
+              <w:top w:type="dxa" w:w="100"/>
+              <w:left w:type="dxa" w:w="120"/>
+              <w:bottom w:type="dxa" w:w="100"/>
+              <w:right w:type="dxa" w:w="120"/>
+            </w:tcMar>
+            <w:vAlign w:val="center"/>
+          </w:tcPr>
+          <w:p>
+            <w:pPr>
+              <w:jc w:val="left"/>
+            </w:pPr>
+            <w:r>
+              <w:rPr>
+                <w:rFonts w:ascii="Calibri" w:cs="Calibri" w:eastAsia="Calibri" w:hAnsi="Calibri"/>
+                <w:b w:val="false"/>
+                <w:bCs w:val="false"/>
+                <w:color w:val="22302A"/>
+                <w:sz w:val="20"/>
+                <w:szCs w:val="20"/>
+              </w:rPr>
+              <w:t xml:space="preserve">service_id</w:t>
+            </w:r>
+          </w:p>
+        </w:tc>
+        <w:tc>
+          <w:tcPr>
+            <w:tcW w:type="dxa" w:w="2805"/>
+            <w:tcMar>
+              <w:top w:type="dxa" w:w="100"/>
+              <w:left w:type="dxa" w:w="120"/>
+              <w:bottom w:type="dxa" w:w="100"/>
+              <w:right w:type="dxa" w:w="120"/>
+            </w:tcMar>
+            <w:vAlign w:val="center"/>
+          </w:tcPr>
+          <w:p>
+            <w:pPr>
+              <w:jc w:val="left"/>
+            </w:pPr>
+            <w:r>
+              <w:rPr>
+                <w:rFonts w:ascii="Calibri" w:cs="Calibri" w:eastAsia="Calibri" w:hAnsi="Calibri"/>
+                <w:b w:val="false"/>
+                <w:bCs w:val="false"/>
+                <w:color w:val="22302A"/>
+                <w:sz w:val="20"/>
+                <w:szCs w:val="20"/>
+              </w:rPr>
+              <w:t xml:space="preserve">UUID (FK → services.id, nullable)</w:t>
+            </w:r>
+          </w:p>
+        </w:tc>
+        <w:tc>
+          <w:tcPr>
+            <w:tcW w:type="dxa" w:w="4488"/>
+            <w:tcMar>
+              <w:top w:type="dxa" w:w="100"/>
+              <w:left w:type="dxa" w:w="120"/>
+              <w:bottom w:type="dxa" w:w="100"/>
+              <w:right w:type="dxa" w:w="120"/>
+            </w:tcMar>
+            <w:vAlign w:val="center"/>
+          </w:tcPr>
+          <w:p>
+            <w:pPr>
+              <w:jc w:val="left"/>
+            </w:pPr>
+            <w:r>
+              <w:rPr>
+                <w:rFonts w:ascii="Calibri" w:cs="Calibri" w:eastAsia="Calibri" w:hAnsi="Calibri"/>
+                <w:b w:val="false"/>
+                <w:bCs w:val="false"/>
+                <w:color w:val="22302A"/>
+                <w:sz w:val="20"/>
+                <w:szCs w:val="20"/>
+              </w:rPr>
+              <w:t xml:space="preserve">Gắn với 1 dịch vụ cụ thể, có thể để trống.</w:t>
+            </w:r>
+          </w:p>
+        </w:tc>
+      </w:tr>
+      <w:tr>
+        <w:tc>
+          <w:tcPr>
+            <w:tcW w:type="dxa" w:w="2057"/>
+            <w:shd w:fill="F4F4F2" w:val="clear"/>
+            <w:tcMar>
+              <w:top w:type="dxa" w:w="100"/>
+              <w:left w:type="dxa" w:w="120"/>
+              <w:bottom w:type="dxa" w:w="100"/>
+              <w:right w:type="dxa" w:w="120"/>
+            </w:tcMar>
+            <w:vAlign w:val="center"/>
+          </w:tcPr>
+          <w:p>
+            <w:pPr>
+              <w:jc w:val="left"/>
+            </w:pPr>
+            <w:r>
+              <w:rPr>
+                <w:rFonts w:ascii="Calibri" w:cs="Calibri" w:eastAsia="Calibri" w:hAnsi="Calibri"/>
+                <w:b w:val="false"/>
+                <w:bCs w:val="false"/>
+                <w:color w:val="22302A"/>
+                <w:sz w:val="20"/>
+                <w:szCs w:val="20"/>
+              </w:rPr>
+              <w:t xml:space="preserve">region</w:t>
+            </w:r>
+          </w:p>
+        </w:tc>
+        <w:tc>
+          <w:tcPr>
+            <w:tcW w:type="dxa" w:w="2805"/>
+            <w:shd w:fill="F4F4F2" w:val="clear"/>
+            <w:tcMar>
+              <w:top w:type="dxa" w:w="100"/>
+              <w:left w:type="dxa" w:w="120"/>
+              <w:bottom w:type="dxa" w:w="100"/>
+              <w:right w:type="dxa" w:w="120"/>
+            </w:tcMar>
+            <w:vAlign w:val="center"/>
+          </w:tcPr>
+          <w:p>
+            <w:pPr>
+              <w:jc w:val="left"/>
+            </w:pPr>
+            <w:r>
+              <w:rPr>
+                <w:rFonts w:ascii="Calibri" w:cs="Calibri" w:eastAsia="Calibri" w:hAnsi="Calibri"/>
+                <w:b w:val="false"/>
+                <w:bCs w:val="false"/>
+                <w:color w:val="22302A"/>
+                <w:sz w:val="20"/>
+                <w:szCs w:val="20"/>
+              </w:rPr>
+              <w:t xml:space="preserve">VARCHAR(100)</w:t>
+            </w:r>
+          </w:p>
+        </w:tc>
+        <w:tc>
+          <w:tcPr>
+            <w:tcW w:type="dxa" w:w="4488"/>
+            <w:shd w:fill="F4F4F2" w:val="clear"/>
+            <w:tcMar>
+              <w:top w:type="dxa" w:w="100"/>
+              <w:left w:type="dxa" w:w="120"/>
+              <w:bottom w:type="dxa" w:w="100"/>
+              <w:right w:type="dxa" w:w="120"/>
+            </w:tcMar>
+            <w:vAlign w:val="center"/>
+          </w:tcPr>
+          <w:p>
+            <w:pPr>
+              <w:jc w:val="left"/>
+            </w:pPr>
+            <w:r>
+              <w:rPr>
+                <w:rFonts w:ascii="Calibri" w:cs="Calibri" w:eastAsia="Calibri" w:hAnsi="Calibri"/>
+                <w:b w:val="false"/>
+                <w:bCs w:val="false"/>
+                <w:color w:val="22302A"/>
+                <w:sz w:val="20"/>
+                <w:szCs w:val="20"/>
+              </w:rPr>
+              <w:t xml:space="preserve">Khu vực sinh sống hiển thị kèm tên.</w:t>
+            </w:r>
+          </w:p>
+        </w:tc>
+      </w:tr>
+      <w:tr>
+        <w:tc>
+          <w:tcPr>
+            <w:tcW w:type="dxa" w:w="2057"/>
+            <w:tcMar>
+              <w:top w:type="dxa" w:w="100"/>
+              <w:left w:type="dxa" w:w="120"/>
+              <w:bottom w:type="dxa" w:w="100"/>
+              <w:right w:type="dxa" w:w="120"/>
+            </w:tcMar>
+            <w:vAlign w:val="center"/>
+          </w:tcPr>
+          <w:p>
+            <w:pPr>
+              <w:jc w:val="left"/>
+            </w:pPr>
+            <w:r>
+              <w:rPr>
+                <w:rFonts w:ascii="Calibri" w:cs="Calibri" w:eastAsia="Calibri" w:hAnsi="Calibri"/>
+                <w:b w:val="false"/>
+                <w:bCs w:val="false"/>
+                <w:color w:val="22302A"/>
+                <w:sz w:val="20"/>
+                <w:szCs w:val="20"/>
+              </w:rPr>
+              <w:t xml:space="preserve">is_approved</w:t>
+            </w:r>
+          </w:p>
+        </w:tc>
+        <w:tc>
+          <w:tcPr>
+            <w:tcW w:type="dxa" w:w="2805"/>
+            <w:tcMar>
+              <w:top w:type="dxa" w:w="100"/>
+              <w:left w:type="dxa" w:w="120"/>
+              <w:bottom w:type="dxa" w:w="100"/>
+              <w:right w:type="dxa" w:w="120"/>
+            </w:tcMar>
+            <w:vAlign w:val="center"/>
+          </w:tcPr>
+          <w:p>
+            <w:pPr>
+              <w:jc w:val="left"/>
+            </w:pPr>
+            <w:r>
+              <w:rPr>
+                <w:rFonts w:ascii="Calibri" w:cs="Calibri" w:eastAsia="Calibri" w:hAnsi="Calibri"/>
+                <w:b w:val="false"/>
+                <w:bCs w:val="false"/>
+                <w:color w:val="22302A"/>
+                <w:sz w:val="20"/>
+                <w:szCs w:val="20"/>
+              </w:rPr>
+              <w:t xml:space="preserve">BOOLEAN DEFAULT false</w:t>
+            </w:r>
+          </w:p>
+        </w:tc>
+        <w:tc>
+          <w:tcPr>
+            <w:tcW w:type="dxa" w:w="4488"/>
+            <w:tcMar>
+              <w:top w:type="dxa" w:w="100"/>
+              <w:left w:type="dxa" w:w="120"/>
+              <w:bottom w:type="dxa" w:w="100"/>
+              <w:right w:type="dxa" w:w="120"/>
+            </w:tcMar>
+            <w:vAlign w:val="center"/>
+          </w:tcPr>
+          <w:p>
+            <w:pPr>
+              <w:jc w:val="left"/>
+            </w:pPr>
+            <w:r>
+              <w:rPr>
+                <w:rFonts w:ascii="Calibri" w:cs="Calibri" w:eastAsia="Calibri" w:hAnsi="Calibri"/>
+                <w:b w:val="false"/>
+                <w:bCs w:val="false"/>
+                <w:color w:val="22302A"/>
+                <w:sz w:val="20"/>
+                <w:szCs w:val="20"/>
+              </w:rPr>
+              <w:t xml:space="preserve">BẮT BUỘC — chỉ hiển thị công khai (mục 7.10/12) sau khi Admin duyệt; tránh đánh giá spam/không phù hợp hiển thị ngay lập tức.</w:t>
+            </w:r>
+          </w:p>
+        </w:tc>
+      </w:tr>
+    </w:tbl>
+    <w:p>
+      <w:pPr>
+        <w:pStyle w:val="Heading3"/>
+        <w:spacing w:after="100" w:before="220"/>
+      </w:pPr>
+      <w:r>
+        <w:rPr>
+          <w:rFonts w:ascii="Calibri" w:cs="Calibri" w:eastAsia="Calibri" w:hAnsi="Calibri"/>
+          <w:b/>
+          <w:bCs/>
+          <w:color w:val="2FA968"/>
+        </w:rPr>
+        <w:t xml:space="preserve">contact_messages / lab_test_requests / teleconsult_requests</w:t>
+      </w:r>
+    </w:p>
+    <w:p>
+      <w:pPr>
+        <w:spacing w:after="140" w:line="300"/>
+      </w:pPr>
+      <w:r>
+        <w:rPr>
+          <w:rFonts w:ascii="Calibri" w:cs="Calibri" w:eastAsia="Calibri" w:hAnsi="Calibri"/>
+          <w:color w:val="22302A"/>
+          <w:sz w:val="21"/>
+          <w:szCs w:val="21"/>
+        </w:rPr>
+        <w:t xml:space="preserve">Cả 3 bảng có cấu trúc tương tự nhau (form đơn giản, mục 8.5/8.6), gộp chung mô tả: id (UUID PK), full_name, phone, email (tuỳ chọn), nội dung/yêu cầu (TEXT — riêng lab_test_requests có thêm cột test_types dạng mảng/JSON cho các loại xét nghiệm đã chọn), status ENUM (mới / đang_xử_lý / đã_xử_lý), created_at.</w:t>
+      </w:r>
+    </w:p>
+    <w:p>
+      <w:pPr>
+        <w:pStyle w:val="Heading3"/>
+        <w:spacing w:after="100" w:before="220"/>
+      </w:pPr>
+      <w:r>
+        <w:rPr>
+          <w:rFonts w:ascii="Calibri" w:cs="Calibri" w:eastAsia="Calibri" w:hAnsi="Calibri"/>
+          <w:b/>
+          <w:bCs/>
+          <w:color w:val="2FA968"/>
+        </w:rPr>
+        <w:t xml:space="preserve">price_list (mới — backing cho mục 8.7 Chi phí điều trị)</w:t>
+      </w:r>
+    </w:p>
+    <w:tbl>
+      <w:tblPr>
+        <w:tblW w:type="dxa" w:w="9350"/>
+        <w:tblBorders>
+          <w:top w:val="single" w:color="auto" w:sz="4"/>
+          <w:left w:val="single" w:color="auto" w:sz="4"/>
+          <w:bottom w:val="single" w:color="auto" w:sz="4"/>
+          <w:right w:val="single" w:color="auto" w:sz="4"/>
+          <w:insideH w:val="single" w:color="auto" w:sz="4"/>
+          <w:insideV w:val="single" w:color="auto" w:sz="4"/>
+        </w:tblBorders>
+      </w:tblPr>
+      <w:tblGrid>
+        <w:gridCol w:w="2057"/>
+        <w:gridCol w:w="2805"/>
+        <w:gridCol w:w="4488"/>
+      </w:tblGrid>
+      <w:tr>
+        <w:trPr>
+          <w:tblHeader/>
+        </w:trPr>
+        <w:tc>
+          <w:tcPr>
+            <w:tcW w:type="dxa" w:w="2057"/>
+            <w:shd w:fill="164B36" w:val="clear"/>
+            <w:tcMar>
+              <w:top w:type="dxa" w:w="100"/>
+              <w:left w:type="dxa" w:w="120"/>
+              <w:bottom w:type="dxa" w:w="100"/>
+              <w:right w:type="dxa" w:w="120"/>
+            </w:tcMar>
+            <w:vAlign w:val="center"/>
+          </w:tcPr>
+          <w:p>
+            <w:pPr>
+              <w:jc w:val="left"/>
+            </w:pPr>
+            <w:r>
+              <w:rPr>
+                <w:rFonts w:ascii="Calibri" w:cs="Calibri" w:eastAsia="Calibri" w:hAnsi="Calibri"/>
+                <w:b/>
+                <w:bCs/>
+                <w:color w:val="FFFFFF"/>
+                <w:sz w:val="19"/>
+                <w:szCs w:val="19"/>
+              </w:rPr>
+              <w:t xml:space="preserve">Trường</w:t>
+            </w:r>
+          </w:p>
+        </w:tc>
+        <w:tc>
+          <w:tcPr>
+            <w:tcW w:type="dxa" w:w="2805"/>
+            <w:shd w:fill="164B36" w:val="clear"/>
+            <w:tcMar>
+              <w:top w:type="dxa" w:w="100"/>
+              <w:left w:type="dxa" w:w="120"/>
+              <w:bottom w:type="dxa" w:w="100"/>
+              <w:right w:type="dxa" w:w="120"/>
+            </w:tcMar>
+            <w:vAlign w:val="center"/>
+          </w:tcPr>
+          <w:p>
+            <w:pPr>
+              <w:jc w:val="left"/>
+            </w:pPr>
+            <w:r>
+              <w:rPr>
+                <w:rFonts w:ascii="Calibri" w:cs="Calibri" w:eastAsia="Calibri" w:hAnsi="Calibri"/>
+                <w:b/>
+                <w:bCs/>
+                <w:color w:val="FFFFFF"/>
+                <w:sz w:val="19"/>
+                <w:szCs w:val="19"/>
+              </w:rPr>
+              <w:t xml:space="preserve">Kiểu dữ liệu</w:t>
+            </w:r>
+          </w:p>
+        </w:tc>
+        <w:tc>
+          <w:tcPr>
+            <w:tcW w:type="dxa" w:w="4488"/>
+            <w:shd w:fill="164B36" w:val="clear"/>
+            <w:tcMar>
+              <w:top w:type="dxa" w:w="100"/>
+              <w:left w:type="dxa" w:w="120"/>
+              <w:bottom w:type="dxa" w:w="100"/>
+              <w:right w:type="dxa" w:w="120"/>
+            </w:tcMar>
+            <w:vAlign w:val="center"/>
+          </w:tcPr>
+          <w:p>
+            <w:pPr>
+              <w:jc w:val="left"/>
+            </w:pPr>
+            <w:r>
+              <w:rPr>
+                <w:rFonts w:ascii="Calibri" w:cs="Calibri" w:eastAsia="Calibri" w:hAnsi="Calibri"/>
+                <w:b/>
+                <w:bCs/>
+                <w:color w:val="FFFFFF"/>
+                <w:sz w:val="19"/>
+                <w:szCs w:val="19"/>
+              </w:rPr>
+              <w:t xml:space="preserve">Ghi chú</w:t>
+            </w:r>
+          </w:p>
+        </w:tc>
+      </w:tr>
+      <w:tr>
+        <w:tc>
+          <w:tcPr>
+            <w:tcW w:type="dxa" w:w="2057"/>
+            <w:tcMar>
+              <w:top w:type="dxa" w:w="100"/>
+              <w:left w:type="dxa" w:w="120"/>
+              <w:bottom w:type="dxa" w:w="100"/>
+              <w:right w:type="dxa" w:w="120"/>
+            </w:tcMar>
+            <w:vAlign w:val="center"/>
+          </w:tcPr>
+          <w:p>
+            <w:pPr>
+              <w:jc w:val="left"/>
+            </w:pPr>
+            <w:r>
+              <w:rPr>
+                <w:rFonts w:ascii="Calibri" w:cs="Calibri" w:eastAsia="Calibri" w:hAnsi="Calibri"/>
+                <w:b w:val="false"/>
+                <w:bCs w:val="false"/>
+                <w:color w:val="22302A"/>
+                <w:sz w:val="20"/>
+                <w:szCs w:val="20"/>
+              </w:rPr>
+              <w:t xml:space="preserve">id</w:t>
+            </w:r>
+          </w:p>
+        </w:tc>
+        <w:tc>
+          <w:tcPr>
+            <w:tcW w:type="dxa" w:w="2805"/>
+            <w:tcMar>
+              <w:top w:type="dxa" w:w="100"/>
+              <w:left w:type="dxa" w:w="120"/>
+              <w:bottom w:type="dxa" w:w="100"/>
+              <w:right w:type="dxa" w:w="120"/>
+            </w:tcMar>
+            <w:vAlign w:val="center"/>
+          </w:tcPr>
+          <w:p>
+            <w:pPr>
+              <w:jc w:val="left"/>
+            </w:pPr>
+            <w:r>
+              <w:rPr>
+                <w:rFonts w:ascii="Calibri" w:cs="Calibri" w:eastAsia="Calibri" w:hAnsi="Calibri"/>
+                <w:b w:val="false"/>
+                <w:bCs w:val="false"/>
+                <w:color w:val="22302A"/>
+                <w:sz w:val="20"/>
+                <w:szCs w:val="20"/>
+              </w:rPr>
+              <w:t xml:space="preserve">UUID (PK)</w:t>
+            </w:r>
+          </w:p>
+        </w:tc>
+        <w:tc>
+          <w:tcPr>
+            <w:tcW w:type="dxa" w:w="4488"/>
+            <w:tcMar>
+              <w:top w:type="dxa" w:w="100"/>
+              <w:left w:type="dxa" w:w="120"/>
+              <w:bottom w:type="dxa" w:w="100"/>
+              <w:right w:type="dxa" w:w="120"/>
+            </w:tcMar>
+            <w:vAlign w:val="center"/>
+          </w:tcPr>
+          <w:p>
+            <w:pPr>
+              <w:jc w:val="left"/>
+            </w:pPr>
+            <w:r>
+              <w:rPr>
+                <w:rFonts w:ascii="Calibri" w:cs="Calibri" w:eastAsia="Calibri" w:hAnsi="Calibri"/>
+                <w:b w:val="false"/>
+                <w:bCs w:val="false"/>
+                <w:color w:val="22302A"/>
+                <w:sz w:val="20"/>
+                <w:szCs w:val="20"/>
+              </w:rPr>
+              <w:t xml:space="preserve">Khoá chính.</w:t>
+            </w:r>
+          </w:p>
+        </w:tc>
+      </w:tr>
+      <w:tr>
+        <w:tc>
+          <w:tcPr>
+            <w:tcW w:type="dxa" w:w="2057"/>
+            <w:shd w:fill="F4F4F2" w:val="clear"/>
+            <w:tcMar>
+              <w:top w:type="dxa" w:w="100"/>
+              <w:left w:type="dxa" w:w="120"/>
+              <w:bottom w:type="dxa" w:w="100"/>
+              <w:right w:type="dxa" w:w="120"/>
+            </w:tcMar>
+            <w:vAlign w:val="center"/>
+          </w:tcPr>
+          <w:p>
+            <w:pPr>
+              <w:jc w:val="left"/>
+            </w:pPr>
+            <w:r>
+              <w:rPr>
+                <w:rFonts w:ascii="Calibri" w:cs="Calibri" w:eastAsia="Calibri" w:hAnsi="Calibri"/>
+                <w:b w:val="false"/>
+                <w:bCs w:val="false"/>
+                <w:color w:val="22302A"/>
+                <w:sz w:val="20"/>
+                <w:szCs w:val="20"/>
+              </w:rPr>
+              <w:t xml:space="preserve">service_id / specialty_id</w:t>
+            </w:r>
+          </w:p>
+        </w:tc>
+        <w:tc>
+          <w:tcPr>
+            <w:tcW w:type="dxa" w:w="2805"/>
+            <w:shd w:fill="F4F4F2" w:val="clear"/>
+            <w:tcMar>
+              <w:top w:type="dxa" w:w="100"/>
+              <w:left w:type="dxa" w:w="120"/>
+              <w:bottom w:type="dxa" w:w="100"/>
+              <w:right w:type="dxa" w:w="120"/>
+            </w:tcMar>
+            <w:vAlign w:val="center"/>
+          </w:tcPr>
+          <w:p>
+            <w:pPr>
+              <w:jc w:val="left"/>
+            </w:pPr>
+            <w:r>
+              <w:rPr>
+                <w:rFonts w:ascii="Calibri" w:cs="Calibri" w:eastAsia="Calibri" w:hAnsi="Calibri"/>
+                <w:b w:val="false"/>
+                <w:bCs w:val="false"/>
+                <w:color w:val="22302A"/>
+                <w:sz w:val="20"/>
+                <w:szCs w:val="20"/>
+              </w:rPr>
+              <w:t xml:space="preserve">UUID (FK, nullable — 1 trong 2)</w:t>
+            </w:r>
+          </w:p>
+        </w:tc>
+        <w:tc>
+          <w:tcPr>
+            <w:tcW w:type="dxa" w:w="4488"/>
+            <w:shd w:fill="F4F4F2" w:val="clear"/>
+            <w:tcMar>
+              <w:top w:type="dxa" w:w="100"/>
+              <w:left w:type="dxa" w:w="120"/>
+              <w:bottom w:type="dxa" w:w="100"/>
+              <w:right w:type="dxa" w:w="120"/>
+            </w:tcMar>
+            <w:vAlign w:val="center"/>
+          </w:tcPr>
+          <w:p>
+            <w:pPr>
+              <w:jc w:val="left"/>
+            </w:pPr>
+            <w:r>
+              <w:rPr>
+                <w:rFonts w:ascii="Calibri" w:cs="Calibri" w:eastAsia="Calibri" w:hAnsi="Calibri"/>
+                <w:b w:val="false"/>
+                <w:bCs w:val="false"/>
+                <w:color w:val="22302A"/>
+                <w:sz w:val="20"/>
+                <w:szCs w:val="20"/>
+              </w:rPr>
+              <w:t xml:space="preserve">Giá có thể gắn theo dịch vụ hoặc theo chuyên khoa.</w:t>
+            </w:r>
+          </w:p>
+        </w:tc>
+      </w:tr>
+      <w:tr>
+        <w:tc>
+          <w:tcPr>
+            <w:tcW w:type="dxa" w:w="2057"/>
+            <w:tcMar>
+              <w:top w:type="dxa" w:w="100"/>
+              <w:left w:type="dxa" w:w="120"/>
+              <w:bottom w:type="dxa" w:w="100"/>
+              <w:right w:type="dxa" w:w="120"/>
+            </w:tcMar>
+            <w:vAlign w:val="center"/>
+          </w:tcPr>
+          <w:p>
+            <w:pPr>
+              <w:jc w:val="left"/>
+            </w:pPr>
+            <w:r>
+              <w:rPr>
+                <w:rFonts w:ascii="Calibri" w:cs="Calibri" w:eastAsia="Calibri" w:hAnsi="Calibri"/>
+                <w:b w:val="false"/>
+                <w:bCs w:val="false"/>
+                <w:color w:val="22302A"/>
+                <w:sz w:val="20"/>
+                <w:szCs w:val="20"/>
+              </w:rPr>
+              <w:t xml:space="preserve">item_name</w:t>
+            </w:r>
+          </w:p>
+        </w:tc>
+        <w:tc>
+          <w:tcPr>
+            <w:tcW w:type="dxa" w:w="2805"/>
+            <w:tcMar>
+              <w:top w:type="dxa" w:w="100"/>
+              <w:left w:type="dxa" w:w="120"/>
+              <w:bottom w:type="dxa" w:w="100"/>
+              <w:right w:type="dxa" w:w="120"/>
+            </w:tcMar>
+            <w:vAlign w:val="center"/>
+          </w:tcPr>
+          <w:p>
+            <w:pPr>
+              <w:jc w:val="left"/>
+            </w:pPr>
+            <w:r>
+              <w:rPr>
+                <w:rFonts w:ascii="Calibri" w:cs="Calibri" w:eastAsia="Calibri" w:hAnsi="Calibri"/>
+                <w:b w:val="false"/>
+                <w:bCs w:val="false"/>
+                <w:color w:val="22302A"/>
+                <w:sz w:val="20"/>
+                <w:szCs w:val="20"/>
+              </w:rPr>
+              <w:t xml:space="preserve">VARCHAR(200)</w:t>
+            </w:r>
+          </w:p>
+        </w:tc>
+        <w:tc>
+          <w:tcPr>
+            <w:tcW w:type="dxa" w:w="4488"/>
+            <w:tcMar>
+              <w:top w:type="dxa" w:w="100"/>
+              <w:left w:type="dxa" w:w="120"/>
+              <w:bottom w:type="dxa" w:w="100"/>
+              <w:right w:type="dxa" w:w="120"/>
+            </w:tcMar>
+            <w:vAlign w:val="center"/>
+          </w:tcPr>
+          <w:p>
+            <w:pPr>
+              <w:jc w:val="left"/>
+            </w:pPr>
+            <w:r>
+              <w:rPr>
+                <w:rFonts w:ascii="Calibri" w:cs="Calibri" w:eastAsia="Calibri" w:hAnsi="Calibri"/>
+                <w:b w:val="false"/>
+                <w:bCs w:val="false"/>
+                <w:color w:val="22302A"/>
+                <w:sz w:val="20"/>
+                <w:szCs w:val="20"/>
+              </w:rPr>
+              <w:t xml:space="preserve">Tên hạng mục hiển thị trong bảng giá.</w:t>
+            </w:r>
+          </w:p>
+        </w:tc>
+      </w:tr>
+      <w:tr>
+        <w:tc>
+          <w:tcPr>
+            <w:tcW w:type="dxa" w:w="2057"/>
+            <w:shd w:fill="F4F4F2" w:val="clear"/>
+            <w:tcMar>
+              <w:top w:type="dxa" w:w="100"/>
+              <w:left w:type="dxa" w:w="120"/>
+              <w:bottom w:type="dxa" w:w="100"/>
+              <w:right w:type="dxa" w:w="120"/>
+            </w:tcMar>
+            <w:vAlign w:val="center"/>
+          </w:tcPr>
+          <w:p>
+            <w:pPr>
+              <w:jc w:val="left"/>
+            </w:pPr>
+            <w:r>
+              <w:rPr>
+                <w:rFonts w:ascii="Calibri" w:cs="Calibri" w:eastAsia="Calibri" w:hAnsi="Calibri"/>
+                <w:b w:val="false"/>
+                <w:bCs w:val="false"/>
+                <w:color w:val="22302A"/>
+                <w:sz w:val="20"/>
+                <w:szCs w:val="20"/>
+              </w:rPr>
+              <w:t xml:space="preserve">price</w:t>
+            </w:r>
+          </w:p>
+        </w:tc>
+        <w:tc>
+          <w:tcPr>
+            <w:tcW w:type="dxa" w:w="2805"/>
+            <w:shd w:fill="F4F4F2" w:val="clear"/>
+            <w:tcMar>
+              <w:top w:type="dxa" w:w="100"/>
+              <w:left w:type="dxa" w:w="120"/>
+              <w:bottom w:type="dxa" w:w="100"/>
+              <w:right w:type="dxa" w:w="120"/>
+            </w:tcMar>
+            <w:vAlign w:val="center"/>
+          </w:tcPr>
+          <w:p>
+            <w:pPr>
+              <w:jc w:val="left"/>
+            </w:pPr>
+            <w:r>
+              <w:rPr>
+                <w:rFonts w:ascii="Calibri" w:cs="Calibri" w:eastAsia="Calibri" w:hAnsi="Calibri"/>
+                <w:b w:val="false"/>
+                <w:bCs w:val="false"/>
+                <w:color w:val="22302A"/>
+                <w:sz w:val="20"/>
+                <w:szCs w:val="20"/>
+              </w:rPr>
+              <w:t xml:space="preserve">DECIMAL</w:t>
+            </w:r>
+          </w:p>
+        </w:tc>
+        <w:tc>
+          <w:tcPr>
+            <w:tcW w:type="dxa" w:w="4488"/>
+            <w:shd w:fill="F4F4F2" w:val="clear"/>
+            <w:tcMar>
+              <w:top w:type="dxa" w:w="100"/>
+              <w:left w:type="dxa" w:w="120"/>
+              <w:bottom w:type="dxa" w:w="100"/>
+              <w:right w:type="dxa" w:w="120"/>
+            </w:tcMar>
+            <w:vAlign w:val="center"/>
+          </w:tcPr>
+          <w:p>
+            <w:pPr>
+              <w:jc w:val="left"/>
+            </w:pPr>
+            <w:r>
+              <w:rPr>
+                <w:rFonts w:ascii="Calibri" w:cs="Calibri" w:eastAsia="Calibri" w:hAnsi="Calibri"/>
+                <w:b w:val="false"/>
+                <w:bCs w:val="false"/>
+                <w:color w:val="22302A"/>
+                <w:sz w:val="20"/>
+                <w:szCs w:val="20"/>
+              </w:rPr>
+              <w:t xml:space="preserve">Đơn giá.</w:t>
+            </w:r>
+          </w:p>
+        </w:tc>
+      </w:tr>
+      <w:tr>
+        <w:tc>
+          <w:tcPr>
+            <w:tcW w:type="dxa" w:w="2057"/>
+            <w:tcMar>
+              <w:top w:type="dxa" w:w="100"/>
+              <w:left w:type="dxa" w:w="120"/>
+              <w:bottom w:type="dxa" w:w="100"/>
+              <w:right w:type="dxa" w:w="120"/>
+            </w:tcMar>
+            <w:vAlign w:val="center"/>
+          </w:tcPr>
+          <w:p>
+            <w:pPr>
+              <w:jc w:val="left"/>
+            </w:pPr>
+            <w:r>
+              <w:rPr>
+                <w:rFonts w:ascii="Calibri" w:cs="Calibri" w:eastAsia="Calibri" w:hAnsi="Calibri"/>
+                <w:b w:val="false"/>
+                <w:bCs w:val="false"/>
+                <w:color w:val="22302A"/>
+                <w:sz w:val="20"/>
+                <w:szCs w:val="20"/>
+              </w:rPr>
+              <w:t xml:space="preserve">unit</w:t>
+            </w:r>
+          </w:p>
+        </w:tc>
+        <w:tc>
+          <w:tcPr>
+            <w:tcW w:type="dxa" w:w="2805"/>
+            <w:tcMar>
+              <w:top w:type="dxa" w:w="100"/>
+              <w:left w:type="dxa" w:w="120"/>
+              <w:bottom w:type="dxa" w:w="100"/>
+              <w:right w:type="dxa" w:w="120"/>
+            </w:tcMar>
+            <w:vAlign w:val="center"/>
+          </w:tcPr>
+          <w:p>
+            <w:pPr>
+              <w:jc w:val="left"/>
+            </w:pPr>
+            <w:r>
+              <w:rPr>
+                <w:rFonts w:ascii="Calibri" w:cs="Calibri" w:eastAsia="Calibri" w:hAnsi="Calibri"/>
+                <w:b w:val="false"/>
+                <w:bCs w:val="false"/>
+                <w:color w:val="22302A"/>
+                <w:sz w:val="20"/>
+                <w:szCs w:val="20"/>
+              </w:rPr>
+              <w:t xml:space="preserve">VARCHAR(50)</w:t>
+            </w:r>
+          </w:p>
+        </w:tc>
+        <w:tc>
+          <w:tcPr>
+            <w:tcW w:type="dxa" w:w="4488"/>
+            <w:tcMar>
+              <w:top w:type="dxa" w:w="100"/>
+              <w:left w:type="dxa" w:w="120"/>
+              <w:bottom w:type="dxa" w:w="100"/>
+              <w:right w:type="dxa" w:w="120"/>
+            </w:tcMar>
+            <w:vAlign w:val="center"/>
+          </w:tcPr>
+          <w:p>
+            <w:pPr>
+              <w:jc w:val="left"/>
+            </w:pPr>
+            <w:r>
+              <w:rPr>
+                <w:rFonts w:ascii="Calibri" w:cs="Calibri" w:eastAsia="Calibri" w:hAnsi="Calibri"/>
+                <w:b w:val="false"/>
+                <w:bCs w:val="false"/>
+                <w:color w:val="22302A"/>
+                <w:sz w:val="20"/>
+                <w:szCs w:val="20"/>
+              </w:rPr>
+              <w:t xml:space="preserve">Đơn vị tính (lần/gói/ngày...).</w:t>
+            </w:r>
+          </w:p>
+        </w:tc>
+      </w:tr>
+      <w:tr>
+        <w:tc>
+          <w:tcPr>
+            <w:tcW w:type="dxa" w:w="2057"/>
+            <w:shd w:fill="F4F4F2" w:val="clear"/>
+            <w:tcMar>
+              <w:top w:type="dxa" w:w="100"/>
+              <w:left w:type="dxa" w:w="120"/>
+              <w:bottom w:type="dxa" w:w="100"/>
+              <w:right w:type="dxa" w:w="120"/>
+            </w:tcMar>
+            <w:vAlign w:val="center"/>
+          </w:tcPr>
+          <w:p>
+            <w:pPr>
+              <w:jc w:val="left"/>
+            </w:pPr>
+            <w:r>
+              <w:rPr>
+                <w:rFonts w:ascii="Calibri" w:cs="Calibri" w:eastAsia="Calibri" w:hAnsi="Calibri"/>
+                <w:b w:val="false"/>
+                <w:bCs w:val="false"/>
+                <w:color w:val="22302A"/>
+                <w:sz w:val="20"/>
+                <w:szCs w:val="20"/>
+              </w:rPr>
+              <w:t xml:space="preserve">insurance_note</w:t>
+            </w:r>
+          </w:p>
+        </w:tc>
+        <w:tc>
+          <w:tcPr>
+            <w:tcW w:type="dxa" w:w="2805"/>
+            <w:shd w:fill="F4F4F2" w:val="clear"/>
+            <w:tcMar>
+              <w:top w:type="dxa" w:w="100"/>
+              <w:left w:type="dxa" w:w="120"/>
+              <w:bottom w:type="dxa" w:w="100"/>
+              <w:right w:type="dxa" w:w="120"/>
+            </w:tcMar>
+            <w:vAlign w:val="center"/>
+          </w:tcPr>
+          <w:p>
+            <w:pPr>
+              <w:jc w:val="left"/>
+            </w:pPr>
+            <w:r>
+              <w:rPr>
+                <w:rFonts w:ascii="Calibri" w:cs="Calibri" w:eastAsia="Calibri" w:hAnsi="Calibri"/>
+                <w:b w:val="false"/>
+                <w:bCs w:val="false"/>
+                <w:color w:val="22302A"/>
+                <w:sz w:val="20"/>
+                <w:szCs w:val="20"/>
+              </w:rPr>
+              <w:t xml:space="preserve">VARCHAR(255)</w:t>
+            </w:r>
+          </w:p>
+        </w:tc>
+        <w:tc>
+          <w:tcPr>
+            <w:tcW w:type="dxa" w:w="4488"/>
+            <w:shd w:fill="F4F4F2" w:val="clear"/>
+            <w:tcMar>
+              <w:top w:type="dxa" w:w="100"/>
+              <w:left w:type="dxa" w:w="120"/>
+              <w:bottom w:type="dxa" w:w="100"/>
+              <w:right w:type="dxa" w:w="120"/>
+            </w:tcMar>
+            <w:vAlign w:val="center"/>
+          </w:tcPr>
+          <w:p>
+            <w:pPr>
+              <w:jc w:val="left"/>
+            </w:pPr>
+            <w:r>
+              <w:rPr>
+                <w:rFonts w:ascii="Calibri" w:cs="Calibri" w:eastAsia="Calibri" w:hAnsi="Calibri"/>
+                <w:b w:val="false"/>
+                <w:bCs w:val="false"/>
+                <w:color w:val="22302A"/>
+                <w:sz w:val="20"/>
+                <w:szCs w:val="20"/>
+              </w:rPr>
+              <w:t xml:space="preserve">Ghi chú về BHYT (mục 8.7).</w:t>
+            </w:r>
+          </w:p>
+        </w:tc>
+      </w:tr>
+    </w:tbl>
+    <w:p>
+      <w:pPr>
+        <w:pStyle w:val="Heading3"/>
+        <w:spacing w:after="100" w:before="220"/>
+      </w:pPr>
+      <w:r>
+        <w:rPr>
+          <w:rFonts w:ascii="Calibri" w:cs="Calibri" w:eastAsia="Calibri" w:hAnsi="Calibri"/>
+          <w:b/>
+          <w:bCs/>
+          <w:color w:val="2FA968"/>
+        </w:rPr>
+        <w:t xml:space="preserve">facilities (mới — backing cho Template F đa cơ sở, mục 8.6)</w:t>
+      </w:r>
+    </w:p>
+    <w:p>
+      <w:pPr>
+        <w:pStyle w:val="ListParagraph"/>
+        <w:numPr>
+          <w:ilvl w:val="0"/>
+          <w:numId w:val="2"/>
+        </w:numPr>
+        <w:spacing w:after="90" w:line="290"/>
+      </w:pPr>
+      <w:r>
+        <w:rPr>
+          <w:rFonts w:ascii="Calibri" w:cs="Calibri" w:eastAsia="Calibri" w:hAnsi="Calibri"/>
+          <w:color w:val="22302A"/>
+          <w:sz w:val="21"/>
+          <w:szCs w:val="21"/>
+        </w:rPr>
+        <w:t xml:space="preserve">facilities: id (UUID PK), name, address, phone, latitude, longitude, description, is_main (BOOLEAN — đánh dấu cơ sở chính để mặc định chọn tab đầu tiên ở Template F).</w:t>
+      </w:r>
+    </w:p>
+    <w:p>
+      <w:pPr>
+        <w:pStyle w:val="Heading2"/>
+        <w:spacing w:after="140" w:before="320"/>
+      </w:pPr>
+      <w:r>
+        <w:rPr>
+          <w:rFonts w:ascii="Calibri" w:cs="Calibri" w:eastAsia="Calibri" w:hAnsi="Calibri"/>
+          <w:b/>
+          <w:bCs/>
+          <w:color w:val="164B36"/>
+        </w:rPr>
+        <w:t xml:space="preserve">15.11. Quy tắc đặt tên &amp; quy ước chung</w:t>
+      </w:r>
+    </w:p>
+    <w:p>
+      <w:pPr>
+        <w:pStyle w:val="ListParagraph"/>
+        <w:numPr>
+          <w:ilvl w:val="0"/>
+          <w:numId w:val="2"/>
+        </w:numPr>
+        <w:spacing w:after="90" w:line="290"/>
+      </w:pPr>
+      <w:r>
+        <w:rPr>
+          <w:rFonts w:ascii="Calibri" w:cs="Calibri" w:eastAsia="Calibri" w:hAnsi="Calibri"/>
+          <w:color w:val="22302A"/>
+          <w:sz w:val="21"/>
+          <w:szCs w:val="21"/>
+        </w:rPr>
+        <w:t xml:space="preserve">Tên bảng số nhiều, snake_case (patients, doctor_schedules); tên cột snake_case, không viết tắt tối nghĩa.</w:t>
+      </w:r>
+    </w:p>
+    <w:p>
+      <w:pPr>
+        <w:pStyle w:val="ListParagraph"/>
+        <w:numPr>
+          <w:ilvl w:val="0"/>
+          <w:numId w:val="2"/>
+        </w:numPr>
+        <w:spacing w:after="90" w:line="290"/>
+      </w:pPr>
+      <w:r>
+        <w:rPr>
+          <w:rFonts w:ascii="Calibri" w:cs="Calibri" w:eastAsia="Calibri" w:hAnsi="Calibri"/>
+          <w:color w:val="22302A"/>
+          <w:sz w:val="21"/>
+          <w:szCs w:val="21"/>
+        </w:rPr>
+        <w:t xml:space="preserve">Khoá chính dùng UUID thống nhất cho MỌI bảng (không trộn serial int tự tăng với UUID giữa các bảng, tránh khó khăn khi join/migrate).</w:t>
+      </w:r>
+    </w:p>
+    <w:p>
+      <w:pPr>
+        <w:pStyle w:val="ListParagraph"/>
+        <w:numPr>
+          <w:ilvl w:val="0"/>
+          <w:numId w:val="2"/>
+        </w:numPr>
+        <w:spacing w:after="90" w:line="290"/>
+      </w:pPr>
+      <w:r>
+        <w:rPr>
+          <w:rFonts w:ascii="Calibri" w:cs="Calibri" w:eastAsia="Calibri" w:hAnsi="Calibri"/>
+          <w:color w:val="22302A"/>
+          <w:sz w:val="21"/>
+          <w:szCs w:val="21"/>
+        </w:rPr>
+        <w:t xml:space="preserve">Mọi bảng có created_at/updated_at, ngoại trừ activity_logs (chỉ created_at vì không cho phép UPDATE — mục 15.5).</w:t>
+      </w:r>
+    </w:p>
+    <w:p>
+      <w:pPr>
+        <w:pStyle w:val="ListParagraph"/>
+        <w:numPr>
+          <w:ilvl w:val="0"/>
+          <w:numId w:val="2"/>
+        </w:numPr>
+        <w:spacing w:after="90" w:line="290"/>
+      </w:pPr>
+      <w:r>
+        <w:rPr>
+          <w:rFonts w:ascii="Calibri" w:cs="Calibri" w:eastAsia="Calibri" w:hAnsi="Calibri"/>
+          <w:color w:val="22302A"/>
+          <w:sz w:val="21"/>
+          <w:szCs w:val="21"/>
+        </w:rPr>
+        <w:t xml:space="preserve">Ẩn/hiện tạm thời dùng cờ is_active hoặc is_published (boolean) — KHÔNG dùng deleted_at cho mục đích này. deleted_at (soft-delete) chỉ dùng cho dữ liệu cần lưu vết pháp lý khi xoá thật: patients, doctors, news, testimonials, appointments.</w:t>
+      </w:r>
+    </w:p>
+    <w:p>
+      <w:pPr>
+        <w:pStyle w:val="ListParagraph"/>
+        <w:numPr>
+          <w:ilvl w:val="0"/>
+          <w:numId w:val="2"/>
+        </w:numPr>
+        <w:spacing w:after="90" w:line="290"/>
+      </w:pPr>
+      <w:r>
+        <w:rPr>
+          <w:rFonts w:ascii="Calibri" w:cs="Calibri" w:eastAsia="Calibri" w:hAnsi="Calibri"/>
+          <w:color w:val="22302A"/>
+          <w:sz w:val="21"/>
+          <w:szCs w:val="21"/>
+        </w:rPr>
+        <w:t xml:space="preserve">Danh mục dùng chung (specialties, service_groups, services, news_categories, organization_units) không xoá cứng — luôn dùng is_active để tránh vỡ khoá ngoại ở các bảng đã tham chiếu (doctors, appointments, news...).</w:t>
       </w:r>
     </w:p>
     <w:p>
@@ -24705,6 +29112,95 @@
                 <w:szCs w:val="20"/>
               </w:rPr>
               <w:t xml:space="preserve">Ghi nhận triển khai thực tế Phase 11–13 (RBAC, 9 tab Admin, tính năng Đấu thầu trong Tin tức) vào mục 18 mới; cập nhật đồng bộ RBAC (9.1), điều hướng Admin (9.2), CRUD Tin tức (9.6), Nhật ký hoạt động (9.7), Trạng thái trống (12), An toàn thông tin — bảo mật file upload (14.4), và lược đồ CSDL — bảng news mở rộng, organization_units, admin_users.department_id (15.9).</w:t>
+            </w:r>
+          </w:p>
+        </w:tc>
+      </w:tr>
+      <w:tr>
+        <w:tc>
+          <w:tcPr>
+            <w:tcW w:type="dxa" w:w="1683"/>
+            <w:shd w:fill="F4F4F2" w:val="clear"/>
+            <w:tcMar>
+              <w:top w:type="dxa" w:w="100"/>
+              <w:left w:type="dxa" w:w="120"/>
+              <w:bottom w:type="dxa" w:w="100"/>
+              <w:right w:type="dxa" w:w="120"/>
+            </w:tcMar>
+            <w:vAlign w:val="center"/>
+          </w:tcPr>
+          <w:p>
+            <w:pPr>
+              <w:jc w:val="left"/>
+            </w:pPr>
+            <w:r>
+              <w:rPr>
+                <w:rFonts w:ascii="Calibri" w:cs="Calibri" w:eastAsia="Calibri" w:hAnsi="Calibri"/>
+                <w:b w:val="false"/>
+                <w:bCs w:val="false"/>
+                <w:color w:val="22302A"/>
+                <w:sz w:val="20"/>
+                <w:szCs w:val="20"/>
+              </w:rPr>
+              <w:t xml:space="preserve">2.6</w:t>
+            </w:r>
+          </w:p>
+        </w:tc>
+        <w:tc>
+          <w:tcPr>
+            <w:tcW w:type="dxa" w:w="1683"/>
+            <w:shd w:fill="F4F4F2" w:val="clear"/>
+            <w:tcMar>
+              <w:top w:type="dxa" w:w="100"/>
+              <w:left w:type="dxa" w:w="120"/>
+              <w:bottom w:type="dxa" w:w="100"/>
+              <w:right w:type="dxa" w:w="120"/>
+            </w:tcMar>
+            <w:vAlign w:val="center"/>
+          </w:tcPr>
+          <w:p>
+            <w:pPr>
+              <w:jc w:val="left"/>
+            </w:pPr>
+            <w:r>
+              <w:rPr>
+                <w:rFonts w:ascii="Calibri" w:cs="Calibri" w:eastAsia="Calibri" w:hAnsi="Calibri"/>
+                <w:b w:val="false"/>
+                <w:bCs w:val="false"/>
+                <w:color w:val="22302A"/>
+                <w:sz w:val="20"/>
+                <w:szCs w:val="20"/>
+              </w:rPr>
+              <w:t xml:space="preserve">07/2026</w:t>
+            </w:r>
+          </w:p>
+        </w:tc>
+        <w:tc>
+          <w:tcPr>
+            <w:tcW w:type="dxa" w:w="5984"/>
+            <w:shd w:fill="F4F4F2" w:val="clear"/>
+            <w:tcMar>
+              <w:top w:type="dxa" w:w="100"/>
+              <w:left w:type="dxa" w:w="120"/>
+              <w:bottom w:type="dxa" w:w="100"/>
+              <w:right w:type="dxa" w:w="120"/>
+            </w:tcMar>
+            <w:vAlign w:val="center"/>
+          </w:tcPr>
+          <w:p>
+            <w:pPr>
+              <w:jc w:val="left"/>
+            </w:pPr>
+            <w:r>
+              <w:rPr>
+                <w:rFonts w:ascii="Calibri" w:cs="Calibri" w:eastAsia="Calibri" w:hAnsi="Calibri"/>
+                <w:b w:val="false"/>
+                <w:bCs w:val="false"/>
+                <w:color w:val="22302A"/>
+                <w:sz w:val="20"/>
+                <w:szCs w:val="20"/>
+              </w:rPr>
+              <w:t xml:space="preserve">Hoàn thiện mục 15 (Database): bổ sung schema chi tiết cho 7 bảng còn thiếu (specialties/services, doctors/doctor_schedules, news, testimonials, contact_messages...) tại mục 15.10; sửa mâu thuẫn role enum admin_users (receptionist → department_admin) và thêm cột department_id vào bảng field (15.5); thêm cờ is_approved cho testimonials (khắc phục lỗ hổng kiểm duyệt); bổ sung 2 bảng mới price_list và facilities; thêm mục 15.11 quy tắc đặt tên &amp; quy ước chung.</w:t>
             </w:r>
           </w:p>
         </w:tc>
@@ -29085,7 +33581,7 @@
         <w:sz w:val="16"/>
         <w:szCs w:val="16"/>
       </w:rPr>
-      <w:t xml:space="preserve">Đặc tả UI/UX Website Bệnh viện Đa khoa · v2.5</w:t>
+      <w:t xml:space="preserve">Đặc tả UI/UX Website Bệnh viện Đa khoa · v2.6</w:t>
     </w:r>
   </w:p>
 </w:hdr>

</xml_diff>